<commit_message>
Update Bible resource files for English, French, Hindi, Portuguese, Spanish, and Chinese on 2026-05-06
</commit_message>
<xml_diff>
--- a/eng/docx/009.content.docx
+++ b/eng/docx/009.content.docx
@@ -19,7 +19,7 @@
         <w:rPr>
           <w:lang w:val="en_US" w:bidi="en_US"/>
         </w:rPr>
-        <w:t>Resource: Images (SRV)</w:t>
+        <w:t>Resource: Familiarization, Internalization, Articulation (Fia) Images</w:t>
       </w:r>
       <w:r>
         <w:rPr>
@@ -90,7 +90,7 @@
         <w:rPr>
           <w:lang w:val="en_US" w:bidi="en_US"/>
         </w:rPr>
-        <w:t>Images (SRV)</w:t>
+        <w:t>Familiarization, Internalization, Articulation (Fia) Images</w:t>
       </w:r>
     </w:p>
     <w:p>
@@ -144,26 +144,6 @@
       </w:r>
       <w:r>
         <w:rPr>
-          <w:i/>
-          <w:lang w:val="en_US" w:bidi="en_US"/>
-        </w:rPr>
-        <w:t>Idol, Idol, Incense Altar, Incense Altar, Iron, Iron, Iron, Iron Gate, Iron Gate, Iron Gate</w:t>
-      </w:r>
-      <w:r>
-        <w:rPr>
-          <w:lang w:val="en_US" w:bidi="en_US"/>
-        </w:rPr>
-      </w:r>
-    </w:p>
-    <w:p>
-      <w:pPr/>
-      <w:r>
-        <w:rPr>
-          <w:lang w:val="en_US" w:bidi="en_US"/>
-        </w:rPr>
-      </w:r>
-      <w:r>
-        <w:rPr>
           <w:lang w:val="en_US" w:bidi="en_US"/>
         </w:rPr>
         <w:t xml:space="preserve"> </w:t>
@@ -228,6 +208,11 @@
         </w:rPr>
         <w:t>Image Content</w:t>
       </w:r>
+      <w:r>
+        <w:rPr>
+          <w:lang w:val="en_US" w:bidi="en_US"/>
+        </w:rPr>
+      </w:r>
     </w:p>
     <w:p>
       <w:pPr/>
@@ -238,92 +223,39 @@
       </w:r>
     </w:p>
     <w:p>
-      <w:r/>
-    </w:p>
-    <w:p>
-      <w:r>
-        <w:t>&lt;image: https://cdn.aquifer.bible/aquifer-content/resources/FIAImages/idol.jpg&gt;</w:t>
-      </w:r>
-    </w:p>
-    <w:p>
-      <w:pPr/>
-      <w:r>
-        <w:rPr>
-          <w:lang w:val="en_US" w:bidi="en_US"/>
-        </w:rPr>
-      </w:r>
-      <w:hyperlink r:id="rId13">
-        <w:r>
-          <w:rPr>
-            <w:lang w:val="en_US" w:bidi="en_US"/>
-          </w:rPr>
-          <w:rPr>
-            <w:color w:val="0000EE"/>
-            <w:u w:val="single"/>
-          </w:rPr>
-          <w:t>link</w:t>
-        </w:r>
-      </w:hyperlink>
-      <w:r>
-        <w:rPr>
-          <w:lang w:val="en_US" w:bidi="en_US"/>
-        </w:rPr>
-      </w:r>
-      <w:r>
-        <w:rPr>
-          <w:lang w:val="en_US" w:bidi="en_US"/>
-        </w:rPr>
-      </w:r>
-    </w:p>
-    <w:p>
-      <w:pPr/>
-      <w:r>
-        <w:rPr>
-          <w:lang w:val="en_US" w:bidi="en_US"/>
-        </w:rPr>
-      </w:r>
-    </w:p>
-    <w:p>
-      <w:pPr>
-        <w:pStyle w:val="Heading2"/>
-      </w:pPr>
-      <w:r>
-        <w:rPr>
-          <w:lang w:val="en_US" w:bidi="en_US"/>
-        </w:rPr>
-        <w:t>Idol</w:t>
-      </w:r>
-      <w:r>
-        <w:rPr>
-          <w:lang w:val="en_US" w:bidi="en_US"/>
-        </w:rPr>
-      </w:r>
-    </w:p>
-    <w:p>
-      <w:pPr>
-        <w:pStyle w:val="Heading4"/>
-      </w:pPr>
-      <w:r>
-        <w:rPr>
-          <w:lang w:val="en_US" w:bidi="en_US"/>
-        </w:rPr>
-        <w:t>Image Content</w:t>
-      </w:r>
-    </w:p>
-    <w:p>
-      <w:pPr/>
-      <w:r>
-        <w:rPr>
-          <w:lang w:val="en_US" w:bidi="en_US"/>
-        </w:rPr>
-      </w:r>
-    </w:p>
-    <w:p>
-      <w:r/>
-    </w:p>
-    <w:p>
-      <w:r>
-        <w:t>&lt;image: https://cdn.aquifer.bible/aquifer-content/resources/FIAImages/idol-statue.jpg&gt;</w:t>
+      <w:r>
+        <w:drawing>
+          <wp:inline xmlns:a="http://schemas.openxmlformats.org/drawingml/2006/main" xmlns:pic="http://schemas.openxmlformats.org/drawingml/2006/picture">
+            <wp:extent cx="6096000" cy="8721030"/>
+            <wp:docPr id="1" name="Picture 1"/>
+            <wp:cNvGraphicFramePr>
+              <a:graphicFrameLocks noChangeAspect="1"/>
+            </wp:cNvGraphicFramePr>
+            <a:graphic>
+              <a:graphicData uri="http://schemas.openxmlformats.org/drawingml/2006/picture">
+                <pic:pic>
+                  <pic:nvPicPr>
+                    <pic:cNvPr id="0" name="image.jpg"/>
+                    <pic:cNvPicPr/>
+                  </pic:nvPicPr>
+                  <pic:blipFill>
+                    <a:blip r:embed="rId13"/>
+                    <a:stretch>
+                      <a:fillRect/>
+                    </a:stretch>
+                  </pic:blipFill>
+                  <pic:spPr>
+                    <a:xfrm>
+                      <a:off x="0" y="0"/>
+                      <a:ext cx="6096000" cy="8721030"/>
+                    </a:xfrm>
+                    <a:prstGeom prst="rect"/>
+                  </pic:spPr>
+                </pic:pic>
+              </a:graphicData>
+            </a:graphic>
+          </wp:inline>
+        </w:drawing>
       </w:r>
     </w:p>
     <w:p>
@@ -372,7 +304,7 @@
         <w:rPr>
           <w:lang w:val="en_US" w:bidi="en_US"/>
         </w:rPr>
-        <w:t>Incense Altar</w:t>
+        <w:t>Idol</w:t>
       </w:r>
       <w:r>
         <w:rPr>
@@ -390,6 +322,11 @@
         </w:rPr>
         <w:t>Image Content</w:t>
       </w:r>
+      <w:r>
+        <w:rPr>
+          <w:lang w:val="en_US" w:bidi="en_US"/>
+        </w:rPr>
+      </w:r>
     </w:p>
     <w:p>
       <w:pPr/>
@@ -400,92 +337,39 @@
       </w:r>
     </w:p>
     <w:p>
-      <w:r/>
-    </w:p>
-    <w:p>
-      <w:r>
-        <w:t>&lt;image: https://cdn.aquifer.bible/aquifer-content/resources/FIAImages/altar-incense-utensils.jpg&gt;</w:t>
-      </w:r>
-    </w:p>
-    <w:p>
-      <w:pPr/>
-      <w:r>
-        <w:rPr>
-          <w:lang w:val="en_US" w:bidi="en_US"/>
-        </w:rPr>
-      </w:r>
-      <w:hyperlink r:id="rId15">
-        <w:r>
-          <w:rPr>
-            <w:lang w:val="en_US" w:bidi="en_US"/>
-          </w:rPr>
-          <w:rPr>
-            <w:color w:val="0000EE"/>
-            <w:u w:val="single"/>
-          </w:rPr>
-          <w:t>link</w:t>
-        </w:r>
-      </w:hyperlink>
-      <w:r>
-        <w:rPr>
-          <w:lang w:val="en_US" w:bidi="en_US"/>
-        </w:rPr>
-      </w:r>
-      <w:r>
-        <w:rPr>
-          <w:lang w:val="en_US" w:bidi="en_US"/>
-        </w:rPr>
-      </w:r>
-    </w:p>
-    <w:p>
-      <w:pPr/>
-      <w:r>
-        <w:rPr>
-          <w:lang w:val="en_US" w:bidi="en_US"/>
-        </w:rPr>
-      </w:r>
-    </w:p>
-    <w:p>
-      <w:pPr>
-        <w:pStyle w:val="Heading2"/>
-      </w:pPr>
-      <w:r>
-        <w:rPr>
-          <w:lang w:val="en_US" w:bidi="en_US"/>
-        </w:rPr>
-        <w:t>Incense Altar</w:t>
-      </w:r>
-      <w:r>
-        <w:rPr>
-          <w:lang w:val="en_US" w:bidi="en_US"/>
-        </w:rPr>
-      </w:r>
-    </w:p>
-    <w:p>
-      <w:pPr>
-        <w:pStyle w:val="Heading4"/>
-      </w:pPr>
-      <w:r>
-        <w:rPr>
-          <w:lang w:val="en_US" w:bidi="en_US"/>
-        </w:rPr>
-        <w:t>Image Content</w:t>
-      </w:r>
-    </w:p>
-    <w:p>
-      <w:pPr/>
-      <w:r>
-        <w:rPr>
-          <w:lang w:val="en_US" w:bidi="en_US"/>
-        </w:rPr>
-      </w:r>
-    </w:p>
-    <w:p>
-      <w:r/>
-    </w:p>
-    <w:p>
-      <w:r>
-        <w:t>&lt;image: https://cdn.aquifer.bible/aquifer-content/resources/FIAImages/altar-incense.jpg&gt;</w:t>
+      <w:r>
+        <w:drawing>
+          <wp:inline xmlns:a="http://schemas.openxmlformats.org/drawingml/2006/main" xmlns:pic="http://schemas.openxmlformats.org/drawingml/2006/picture">
+            <wp:extent cx="6096000" cy="9180723"/>
+            <wp:docPr id="2" name="Picture 2"/>
+            <wp:cNvGraphicFramePr>
+              <a:graphicFrameLocks noChangeAspect="1"/>
+            </wp:cNvGraphicFramePr>
+            <a:graphic>
+              <a:graphicData uri="http://schemas.openxmlformats.org/drawingml/2006/picture">
+                <pic:pic>
+                  <pic:nvPicPr>
+                    <pic:cNvPr id="0" name="image.jpg"/>
+                    <pic:cNvPicPr/>
+                  </pic:nvPicPr>
+                  <pic:blipFill>
+                    <a:blip r:embed="rId15"/>
+                    <a:stretch>
+                      <a:fillRect/>
+                    </a:stretch>
+                  </pic:blipFill>
+                  <pic:spPr>
+                    <a:xfrm>
+                      <a:off x="0" y="0"/>
+                      <a:ext cx="6096000" cy="9180723"/>
+                    </a:xfrm>
+                    <a:prstGeom prst="rect"/>
+                  </pic:spPr>
+                </pic:pic>
+              </a:graphicData>
+            </a:graphic>
+          </wp:inline>
+        </w:drawing>
       </w:r>
     </w:p>
     <w:p>
@@ -534,7 +418,7 @@
         <w:rPr>
           <w:lang w:val="en_US" w:bidi="en_US"/>
         </w:rPr>
-        <w:t>Iron</w:t>
+        <w:t>Incense Altar</w:t>
       </w:r>
       <w:r>
         <w:rPr>
@@ -552,6 +436,11 @@
         </w:rPr>
         <w:t>Image Content</w:t>
       </w:r>
+      <w:r>
+        <w:rPr>
+          <w:lang w:val="en_US" w:bidi="en_US"/>
+        </w:rPr>
+      </w:r>
     </w:p>
     <w:p>
       <w:pPr/>
@@ -562,92 +451,39 @@
       </w:r>
     </w:p>
     <w:p>
-      <w:r/>
-    </w:p>
-    <w:p>
-      <w:r>
-        <w:t>&lt;image: https://cdn.aquifer.bible/aquifer-content/resources/FIAImages/iron-view.jpg&gt;</w:t>
-      </w:r>
-    </w:p>
-    <w:p>
-      <w:pPr/>
-      <w:r>
-        <w:rPr>
-          <w:lang w:val="en_US" w:bidi="en_US"/>
-        </w:rPr>
-      </w:r>
-      <w:hyperlink r:id="rId17">
-        <w:r>
-          <w:rPr>
-            <w:lang w:val="en_US" w:bidi="en_US"/>
-          </w:rPr>
-          <w:rPr>
-            <w:color w:val="0000EE"/>
-            <w:u w:val="single"/>
-          </w:rPr>
-          <w:t>link</w:t>
-        </w:r>
-      </w:hyperlink>
-      <w:r>
-        <w:rPr>
-          <w:lang w:val="en_US" w:bidi="en_US"/>
-        </w:rPr>
-      </w:r>
-      <w:r>
-        <w:rPr>
-          <w:lang w:val="en_US" w:bidi="en_US"/>
-        </w:rPr>
-      </w:r>
-    </w:p>
-    <w:p>
-      <w:pPr/>
-      <w:r>
-        <w:rPr>
-          <w:lang w:val="en_US" w:bidi="en_US"/>
-        </w:rPr>
-      </w:r>
-    </w:p>
-    <w:p>
-      <w:pPr>
-        <w:pStyle w:val="Heading2"/>
-      </w:pPr>
-      <w:r>
-        <w:rPr>
-          <w:lang w:val="en_US" w:bidi="en_US"/>
-        </w:rPr>
-        <w:t>Iron</w:t>
-      </w:r>
-      <w:r>
-        <w:rPr>
-          <w:lang w:val="en_US" w:bidi="en_US"/>
-        </w:rPr>
-      </w:r>
-    </w:p>
-    <w:p>
-      <w:pPr>
-        <w:pStyle w:val="Heading4"/>
-      </w:pPr>
-      <w:r>
-        <w:rPr>
-          <w:lang w:val="en_US" w:bidi="en_US"/>
-        </w:rPr>
-        <w:t>Image Content</w:t>
-      </w:r>
-    </w:p>
-    <w:p>
-      <w:pPr/>
-      <w:r>
-        <w:rPr>
-          <w:lang w:val="en_US" w:bidi="en_US"/>
-        </w:rPr>
-      </w:r>
-    </w:p>
-    <w:p>
-      <w:r/>
-    </w:p>
-    <w:p>
-      <w:r>
-        <w:t>&lt;image: https://cdn.aquifer.bible/aquifer-content/resources/FIAImages/iron.jpg&gt;</w:t>
+      <w:r>
+        <w:drawing>
+          <wp:inline xmlns:a="http://schemas.openxmlformats.org/drawingml/2006/main" xmlns:pic="http://schemas.openxmlformats.org/drawingml/2006/picture">
+            <wp:extent cx="6096000" cy="7958225"/>
+            <wp:docPr id="3" name="Picture 3"/>
+            <wp:cNvGraphicFramePr>
+              <a:graphicFrameLocks noChangeAspect="1"/>
+            </wp:cNvGraphicFramePr>
+            <a:graphic>
+              <a:graphicData uri="http://schemas.openxmlformats.org/drawingml/2006/picture">
+                <pic:pic>
+                  <pic:nvPicPr>
+                    <pic:cNvPr id="0" name="image.jpg"/>
+                    <pic:cNvPicPr/>
+                  </pic:nvPicPr>
+                  <pic:blipFill>
+                    <a:blip r:embed="rId17"/>
+                    <a:stretch>
+                      <a:fillRect/>
+                    </a:stretch>
+                  </pic:blipFill>
+                  <pic:spPr>
+                    <a:xfrm>
+                      <a:off x="0" y="0"/>
+                      <a:ext cx="6096000" cy="7958225"/>
+                    </a:xfrm>
+                    <a:prstGeom prst="rect"/>
+                  </pic:spPr>
+                </pic:pic>
+              </a:graphicData>
+            </a:graphic>
+          </wp:inline>
+        </w:drawing>
       </w:r>
     </w:p>
     <w:p>
@@ -696,7 +532,7 @@
         <w:rPr>
           <w:lang w:val="en_US" w:bidi="en_US"/>
         </w:rPr>
-        <w:t>Iron</w:t>
+        <w:t>Incense Altar</w:t>
       </w:r>
       <w:r>
         <w:rPr>
@@ -714,6 +550,11 @@
         </w:rPr>
         <w:t>Image Content</w:t>
       </w:r>
+      <w:r>
+        <w:rPr>
+          <w:lang w:val="en_US" w:bidi="en_US"/>
+        </w:rPr>
+      </w:r>
     </w:p>
     <w:p>
       <w:pPr/>
@@ -724,92 +565,39 @@
       </w:r>
     </w:p>
     <w:p>
-      <w:r/>
-    </w:p>
-    <w:p>
-      <w:r>
-        <w:t>&lt;image: https://cdn.aquifer.bible/aquifer-content/resources/FIAImages/iron-views.jpg&gt;</w:t>
-      </w:r>
-    </w:p>
-    <w:p>
-      <w:pPr/>
-      <w:r>
-        <w:rPr>
-          <w:lang w:val="en_US" w:bidi="en_US"/>
-        </w:rPr>
-      </w:r>
-      <w:hyperlink r:id="rId19">
-        <w:r>
-          <w:rPr>
-            <w:lang w:val="en_US" w:bidi="en_US"/>
-          </w:rPr>
-          <w:rPr>
-            <w:color w:val="0000EE"/>
-            <w:u w:val="single"/>
-          </w:rPr>
-          <w:t>link</w:t>
-        </w:r>
-      </w:hyperlink>
-      <w:r>
-        <w:rPr>
-          <w:lang w:val="en_US" w:bidi="en_US"/>
-        </w:rPr>
-      </w:r>
-      <w:r>
-        <w:rPr>
-          <w:lang w:val="en_US" w:bidi="en_US"/>
-        </w:rPr>
-      </w:r>
-    </w:p>
-    <w:p>
-      <w:pPr/>
-      <w:r>
-        <w:rPr>
-          <w:lang w:val="en_US" w:bidi="en_US"/>
-        </w:rPr>
-      </w:r>
-    </w:p>
-    <w:p>
-      <w:pPr>
-        <w:pStyle w:val="Heading2"/>
-      </w:pPr>
-      <w:r>
-        <w:rPr>
-          <w:lang w:val="en_US" w:bidi="en_US"/>
-        </w:rPr>
-        <w:t>Iron Gate</w:t>
-      </w:r>
-      <w:r>
-        <w:rPr>
-          <w:lang w:val="en_US" w:bidi="en_US"/>
-        </w:rPr>
-      </w:r>
-    </w:p>
-    <w:p>
-      <w:pPr>
-        <w:pStyle w:val="Heading4"/>
-      </w:pPr>
-      <w:r>
-        <w:rPr>
-          <w:lang w:val="en_US" w:bidi="en_US"/>
-        </w:rPr>
-        <w:t>Image Content</w:t>
-      </w:r>
-    </w:p>
-    <w:p>
-      <w:pPr/>
-      <w:r>
-        <w:rPr>
-          <w:lang w:val="en_US" w:bidi="en_US"/>
-        </w:rPr>
-      </w:r>
-    </w:p>
-    <w:p>
-      <w:r/>
-    </w:p>
-    <w:p>
-      <w:r>
-        <w:t>&lt;image: https://cdn.aquifer.bible/aquifer-content/resources/FIAImages/iron-gates.jpg&gt;</w:t>
+      <w:r>
+        <w:drawing>
+          <wp:inline xmlns:a="http://schemas.openxmlformats.org/drawingml/2006/main" xmlns:pic="http://schemas.openxmlformats.org/drawingml/2006/picture">
+            <wp:extent cx="6096000" cy="9139430"/>
+            <wp:docPr id="4" name="Picture 4"/>
+            <wp:cNvGraphicFramePr>
+              <a:graphicFrameLocks noChangeAspect="1"/>
+            </wp:cNvGraphicFramePr>
+            <a:graphic>
+              <a:graphicData uri="http://schemas.openxmlformats.org/drawingml/2006/picture">
+                <pic:pic>
+                  <pic:nvPicPr>
+                    <pic:cNvPr id="0" name="image.jpg"/>
+                    <pic:cNvPicPr/>
+                  </pic:nvPicPr>
+                  <pic:blipFill>
+                    <a:blip r:embed="rId19"/>
+                    <a:stretch>
+                      <a:fillRect/>
+                    </a:stretch>
+                  </pic:blipFill>
+                  <pic:spPr>
+                    <a:xfrm>
+                      <a:off x="0" y="0"/>
+                      <a:ext cx="6096000" cy="9139430"/>
+                    </a:xfrm>
+                    <a:prstGeom prst="rect"/>
+                  </pic:spPr>
+                </pic:pic>
+              </a:graphicData>
+            </a:graphic>
+          </wp:inline>
+        </w:drawing>
       </w:r>
     </w:p>
     <w:p>
@@ -858,7 +646,7 @@
         <w:rPr>
           <w:lang w:val="en_US" w:bidi="en_US"/>
         </w:rPr>
-        <w:t>Iron Gate</w:t>
+        <w:t>Inside of the Tabernacle</w:t>
       </w:r>
       <w:r>
         <w:rPr>
@@ -876,6 +664,11 @@
         </w:rPr>
         <w:t>Image Content</w:t>
       </w:r>
+      <w:r>
+        <w:rPr>
+          <w:lang w:val="en_US" w:bidi="en_US"/>
+        </w:rPr>
+      </w:r>
     </w:p>
     <w:p>
       <w:pPr/>
@@ -886,11 +679,39 @@
       </w:r>
     </w:p>
     <w:p>
-      <w:r/>
-    </w:p>
-    <w:p>
-      <w:r>
-        <w:t>&lt;image: https://cdn.aquifer.bible/aquifer-content/resources/FIAImages/iron-gates-wide.jpg&gt;</w:t>
+      <w:r>
+        <w:drawing>
+          <wp:inline xmlns:a="http://schemas.openxmlformats.org/drawingml/2006/main" xmlns:pic="http://schemas.openxmlformats.org/drawingml/2006/picture">
+            <wp:extent cx="6096000" cy="2560320"/>
+            <wp:docPr id="5" name="Picture 5"/>
+            <wp:cNvGraphicFramePr>
+              <a:graphicFrameLocks noChangeAspect="1"/>
+            </wp:cNvGraphicFramePr>
+            <a:graphic>
+              <a:graphicData uri="http://schemas.openxmlformats.org/drawingml/2006/picture">
+                <pic:pic>
+                  <pic:nvPicPr>
+                    <pic:cNvPr id="0" name="image.jpg"/>
+                    <pic:cNvPicPr/>
+                  </pic:nvPicPr>
+                  <pic:blipFill>
+                    <a:blip r:embed="rId21"/>
+                    <a:stretch>
+                      <a:fillRect/>
+                    </a:stretch>
+                  </pic:blipFill>
+                  <pic:spPr>
+                    <a:xfrm>
+                      <a:off x="0" y="0"/>
+                      <a:ext cx="6096000" cy="2560320"/>
+                    </a:xfrm>
+                    <a:prstGeom prst="rect"/>
+                  </pic:spPr>
+                </pic:pic>
+              </a:graphicData>
+            </a:graphic>
+          </wp:inline>
+        </w:drawing>
       </w:r>
     </w:p>
     <w:p>
@@ -900,7 +721,7 @@
           <w:lang w:val="en_US" w:bidi="en_US"/>
         </w:rPr>
       </w:r>
-      <w:hyperlink r:id="rId21">
+      <w:hyperlink r:id="rId22">
         <w:r>
           <w:rPr>
             <w:lang w:val="en_US" w:bidi="en_US"/>
@@ -939,6 +760,576 @@
         <w:rPr>
           <w:lang w:val="en_US" w:bidi="en_US"/>
         </w:rPr>
+        <w:t>Intestinal Worm</w:t>
+      </w:r>
+      <w:r>
+        <w:rPr>
+          <w:lang w:val="en_US" w:bidi="en_US"/>
+        </w:rPr>
+      </w:r>
+    </w:p>
+    <w:p>
+      <w:pPr>
+        <w:pStyle w:val="Heading4"/>
+      </w:pPr>
+      <w:r>
+        <w:rPr>
+          <w:lang w:val="en_US" w:bidi="en_US"/>
+        </w:rPr>
+        <w:t>Image Content</w:t>
+      </w:r>
+      <w:r>
+        <w:rPr>
+          <w:lang w:val="en_US" w:bidi="en_US"/>
+        </w:rPr>
+      </w:r>
+    </w:p>
+    <w:p>
+      <w:pPr/>
+      <w:r>
+        <w:rPr>
+          <w:lang w:val="en_US" w:bidi="en_US"/>
+        </w:rPr>
+      </w:r>
+    </w:p>
+    <w:p>
+      <w:r>
+        <w:drawing>
+          <wp:inline xmlns:a="http://schemas.openxmlformats.org/drawingml/2006/main" xmlns:pic="http://schemas.openxmlformats.org/drawingml/2006/picture">
+            <wp:extent cx="6096000" cy="4413504"/>
+            <wp:docPr id="6" name="Picture 6"/>
+            <wp:cNvGraphicFramePr>
+              <a:graphicFrameLocks noChangeAspect="1"/>
+            </wp:cNvGraphicFramePr>
+            <a:graphic>
+              <a:graphicData uri="http://schemas.openxmlformats.org/drawingml/2006/picture">
+                <pic:pic>
+                  <pic:nvPicPr>
+                    <pic:cNvPr id="0" name="image.jpg"/>
+                    <pic:cNvPicPr/>
+                  </pic:nvPicPr>
+                  <pic:blipFill>
+                    <a:blip r:embed="rId23"/>
+                    <a:stretch>
+                      <a:fillRect/>
+                    </a:stretch>
+                  </pic:blipFill>
+                  <pic:spPr>
+                    <a:xfrm>
+                      <a:off x="0" y="0"/>
+                      <a:ext cx="6096000" cy="4413504"/>
+                    </a:xfrm>
+                    <a:prstGeom prst="rect"/>
+                  </pic:spPr>
+                </pic:pic>
+              </a:graphicData>
+            </a:graphic>
+          </wp:inline>
+        </w:drawing>
+      </w:r>
+    </w:p>
+    <w:p>
+      <w:pPr/>
+      <w:r>
+        <w:rPr>
+          <w:lang w:val="en_US" w:bidi="en_US"/>
+        </w:rPr>
+      </w:r>
+      <w:hyperlink r:id="rId24">
+        <w:r>
+          <w:rPr>
+            <w:lang w:val="en_US" w:bidi="en_US"/>
+          </w:rPr>
+          <w:rPr>
+            <w:color w:val="0000EE"/>
+            <w:u w:val="single"/>
+          </w:rPr>
+          <w:t>link</w:t>
+        </w:r>
+      </w:hyperlink>
+      <w:r>
+        <w:rPr>
+          <w:lang w:val="en_US" w:bidi="en_US"/>
+        </w:rPr>
+      </w:r>
+      <w:r>
+        <w:rPr>
+          <w:lang w:val="en_US" w:bidi="en_US"/>
+        </w:rPr>
+      </w:r>
+    </w:p>
+    <w:p>
+      <w:pPr/>
+      <w:r>
+        <w:rPr>
+          <w:lang w:val="en_US" w:bidi="en_US"/>
+        </w:rPr>
+      </w:r>
+    </w:p>
+    <w:p>
+      <w:pPr>
+        <w:pStyle w:val="Heading2"/>
+      </w:pPr>
+      <w:r>
+        <w:rPr>
+          <w:lang w:val="en_US" w:bidi="en_US"/>
+        </w:rPr>
+        <w:t>Iron</w:t>
+      </w:r>
+      <w:r>
+        <w:rPr>
+          <w:lang w:val="en_US" w:bidi="en_US"/>
+        </w:rPr>
+      </w:r>
+    </w:p>
+    <w:p>
+      <w:pPr>
+        <w:pStyle w:val="Heading4"/>
+      </w:pPr>
+      <w:r>
+        <w:rPr>
+          <w:lang w:val="en_US" w:bidi="en_US"/>
+        </w:rPr>
+        <w:t>Image Content</w:t>
+      </w:r>
+      <w:r>
+        <w:rPr>
+          <w:lang w:val="en_US" w:bidi="en_US"/>
+        </w:rPr>
+      </w:r>
+    </w:p>
+    <w:p>
+      <w:pPr/>
+      <w:r>
+        <w:rPr>
+          <w:lang w:val="en_US" w:bidi="en_US"/>
+        </w:rPr>
+      </w:r>
+    </w:p>
+    <w:p>
+      <w:r>
+        <w:drawing>
+          <wp:inline xmlns:a="http://schemas.openxmlformats.org/drawingml/2006/main" xmlns:pic="http://schemas.openxmlformats.org/drawingml/2006/picture">
+            <wp:extent cx="6096000" cy="4066032"/>
+            <wp:docPr id="7" name="Picture 7"/>
+            <wp:cNvGraphicFramePr>
+              <a:graphicFrameLocks noChangeAspect="1"/>
+            </wp:cNvGraphicFramePr>
+            <a:graphic>
+              <a:graphicData uri="http://schemas.openxmlformats.org/drawingml/2006/picture">
+                <pic:pic>
+                  <pic:nvPicPr>
+                    <pic:cNvPr id="0" name="image.jpg"/>
+                    <pic:cNvPicPr/>
+                  </pic:nvPicPr>
+                  <pic:blipFill>
+                    <a:blip r:embed="rId25"/>
+                    <a:stretch>
+                      <a:fillRect/>
+                    </a:stretch>
+                  </pic:blipFill>
+                  <pic:spPr>
+                    <a:xfrm>
+                      <a:off x="0" y="0"/>
+                      <a:ext cx="6096000" cy="4066032"/>
+                    </a:xfrm>
+                    <a:prstGeom prst="rect"/>
+                  </pic:spPr>
+                </pic:pic>
+              </a:graphicData>
+            </a:graphic>
+          </wp:inline>
+        </w:drawing>
+      </w:r>
+    </w:p>
+    <w:p>
+      <w:pPr/>
+      <w:r>
+        <w:rPr>
+          <w:lang w:val="en_US" w:bidi="en_US"/>
+        </w:rPr>
+      </w:r>
+      <w:hyperlink r:id="rId26">
+        <w:r>
+          <w:rPr>
+            <w:lang w:val="en_US" w:bidi="en_US"/>
+          </w:rPr>
+          <w:rPr>
+            <w:color w:val="0000EE"/>
+            <w:u w:val="single"/>
+          </w:rPr>
+          <w:t>link</w:t>
+        </w:r>
+      </w:hyperlink>
+      <w:r>
+        <w:rPr>
+          <w:lang w:val="en_US" w:bidi="en_US"/>
+        </w:rPr>
+      </w:r>
+      <w:r>
+        <w:rPr>
+          <w:lang w:val="en_US" w:bidi="en_US"/>
+        </w:rPr>
+      </w:r>
+    </w:p>
+    <w:p>
+      <w:pPr/>
+      <w:r>
+        <w:rPr>
+          <w:lang w:val="en_US" w:bidi="en_US"/>
+        </w:rPr>
+      </w:r>
+    </w:p>
+    <w:p>
+      <w:pPr>
+        <w:pStyle w:val="Heading2"/>
+      </w:pPr>
+      <w:r>
+        <w:rPr>
+          <w:lang w:val="en_US" w:bidi="en_US"/>
+        </w:rPr>
+        <w:t>Iron</w:t>
+      </w:r>
+      <w:r>
+        <w:rPr>
+          <w:lang w:val="en_US" w:bidi="en_US"/>
+        </w:rPr>
+      </w:r>
+    </w:p>
+    <w:p>
+      <w:pPr>
+        <w:pStyle w:val="Heading4"/>
+      </w:pPr>
+      <w:r>
+        <w:rPr>
+          <w:lang w:val="en_US" w:bidi="en_US"/>
+        </w:rPr>
+        <w:t>Image Content</w:t>
+      </w:r>
+      <w:r>
+        <w:rPr>
+          <w:lang w:val="en_US" w:bidi="en_US"/>
+        </w:rPr>
+      </w:r>
+    </w:p>
+    <w:p>
+      <w:pPr/>
+      <w:r>
+        <w:rPr>
+          <w:lang w:val="en_US" w:bidi="en_US"/>
+        </w:rPr>
+      </w:r>
+    </w:p>
+    <w:p>
+      <w:r>
+        <w:drawing>
+          <wp:inline xmlns:a="http://schemas.openxmlformats.org/drawingml/2006/main" xmlns:pic="http://schemas.openxmlformats.org/drawingml/2006/picture">
+            <wp:extent cx="6096000" cy="4066032"/>
+            <wp:docPr id="8" name="Picture 8"/>
+            <wp:cNvGraphicFramePr>
+              <a:graphicFrameLocks noChangeAspect="1"/>
+            </wp:cNvGraphicFramePr>
+            <a:graphic>
+              <a:graphicData uri="http://schemas.openxmlformats.org/drawingml/2006/picture">
+                <pic:pic>
+                  <pic:nvPicPr>
+                    <pic:cNvPr id="0" name="image.jpg"/>
+                    <pic:cNvPicPr/>
+                  </pic:nvPicPr>
+                  <pic:blipFill>
+                    <a:blip r:embed="rId27"/>
+                    <a:stretch>
+                      <a:fillRect/>
+                    </a:stretch>
+                  </pic:blipFill>
+                  <pic:spPr>
+                    <a:xfrm>
+                      <a:off x="0" y="0"/>
+                      <a:ext cx="6096000" cy="4066032"/>
+                    </a:xfrm>
+                    <a:prstGeom prst="rect"/>
+                  </pic:spPr>
+                </pic:pic>
+              </a:graphicData>
+            </a:graphic>
+          </wp:inline>
+        </w:drawing>
+      </w:r>
+    </w:p>
+    <w:p>
+      <w:pPr/>
+      <w:r>
+        <w:rPr>
+          <w:lang w:val="en_US" w:bidi="en_US"/>
+        </w:rPr>
+      </w:r>
+      <w:hyperlink r:id="rId28">
+        <w:r>
+          <w:rPr>
+            <w:lang w:val="en_US" w:bidi="en_US"/>
+          </w:rPr>
+          <w:rPr>
+            <w:color w:val="0000EE"/>
+            <w:u w:val="single"/>
+          </w:rPr>
+          <w:t>link</w:t>
+        </w:r>
+      </w:hyperlink>
+      <w:r>
+        <w:rPr>
+          <w:lang w:val="en_US" w:bidi="en_US"/>
+        </w:rPr>
+      </w:r>
+      <w:r>
+        <w:rPr>
+          <w:lang w:val="en_US" w:bidi="en_US"/>
+        </w:rPr>
+      </w:r>
+    </w:p>
+    <w:p>
+      <w:pPr/>
+      <w:r>
+        <w:rPr>
+          <w:lang w:val="en_US" w:bidi="en_US"/>
+        </w:rPr>
+      </w:r>
+    </w:p>
+    <w:p>
+      <w:pPr>
+        <w:pStyle w:val="Heading2"/>
+      </w:pPr>
+      <w:r>
+        <w:rPr>
+          <w:lang w:val="en_US" w:bidi="en_US"/>
+        </w:rPr>
+        <w:t>Iron</w:t>
+      </w:r>
+      <w:r>
+        <w:rPr>
+          <w:lang w:val="en_US" w:bidi="en_US"/>
+        </w:rPr>
+      </w:r>
+    </w:p>
+    <w:p>
+      <w:pPr>
+        <w:pStyle w:val="Heading4"/>
+      </w:pPr>
+      <w:r>
+        <w:rPr>
+          <w:lang w:val="en_US" w:bidi="en_US"/>
+        </w:rPr>
+        <w:t>Image Content</w:t>
+      </w:r>
+      <w:r>
+        <w:rPr>
+          <w:lang w:val="en_US" w:bidi="en_US"/>
+        </w:rPr>
+      </w:r>
+    </w:p>
+    <w:p>
+      <w:pPr/>
+      <w:r>
+        <w:rPr>
+          <w:lang w:val="en_US" w:bidi="en_US"/>
+        </w:rPr>
+      </w:r>
+    </w:p>
+    <w:p>
+      <w:r>
+        <w:drawing>
+          <wp:inline xmlns:a="http://schemas.openxmlformats.org/drawingml/2006/main" xmlns:pic="http://schemas.openxmlformats.org/drawingml/2006/picture">
+            <wp:extent cx="6096000" cy="3846576"/>
+            <wp:docPr id="9" name="Picture 9"/>
+            <wp:cNvGraphicFramePr>
+              <a:graphicFrameLocks noChangeAspect="1"/>
+            </wp:cNvGraphicFramePr>
+            <a:graphic>
+              <a:graphicData uri="http://schemas.openxmlformats.org/drawingml/2006/picture">
+                <pic:pic>
+                  <pic:nvPicPr>
+                    <pic:cNvPr id="0" name="image.jpg"/>
+                    <pic:cNvPicPr/>
+                  </pic:nvPicPr>
+                  <pic:blipFill>
+                    <a:blip r:embed="rId29"/>
+                    <a:stretch>
+                      <a:fillRect/>
+                    </a:stretch>
+                  </pic:blipFill>
+                  <pic:spPr>
+                    <a:xfrm>
+                      <a:off x="0" y="0"/>
+                      <a:ext cx="6096000" cy="3846576"/>
+                    </a:xfrm>
+                    <a:prstGeom prst="rect"/>
+                  </pic:spPr>
+                </pic:pic>
+              </a:graphicData>
+            </a:graphic>
+          </wp:inline>
+        </w:drawing>
+      </w:r>
+    </w:p>
+    <w:p>
+      <w:pPr/>
+      <w:r>
+        <w:rPr>
+          <w:lang w:val="en_US" w:bidi="en_US"/>
+        </w:rPr>
+      </w:r>
+      <w:hyperlink r:id="rId30">
+        <w:r>
+          <w:rPr>
+            <w:lang w:val="en_US" w:bidi="en_US"/>
+          </w:rPr>
+          <w:rPr>
+            <w:color w:val="0000EE"/>
+            <w:u w:val="single"/>
+          </w:rPr>
+          <w:t>link</w:t>
+        </w:r>
+      </w:hyperlink>
+      <w:r>
+        <w:rPr>
+          <w:lang w:val="en_US" w:bidi="en_US"/>
+        </w:rPr>
+      </w:r>
+      <w:r>
+        <w:rPr>
+          <w:lang w:val="en_US" w:bidi="en_US"/>
+        </w:rPr>
+      </w:r>
+    </w:p>
+    <w:p>
+      <w:pPr/>
+      <w:r>
+        <w:rPr>
+          <w:lang w:val="en_US" w:bidi="en_US"/>
+        </w:rPr>
+      </w:r>
+    </w:p>
+    <w:p>
+      <w:pPr>
+        <w:pStyle w:val="Heading2"/>
+      </w:pPr>
+      <w:r>
+        <w:rPr>
+          <w:lang w:val="en_US" w:bidi="en_US"/>
+        </w:rPr>
+        <w:t>Iron</w:t>
+      </w:r>
+      <w:r>
+        <w:rPr>
+          <w:lang w:val="en_US" w:bidi="en_US"/>
+        </w:rPr>
+      </w:r>
+    </w:p>
+    <w:p>
+      <w:pPr>
+        <w:pStyle w:val="Heading4"/>
+      </w:pPr>
+      <w:r>
+        <w:rPr>
+          <w:lang w:val="en_US" w:bidi="en_US"/>
+        </w:rPr>
+        <w:t>Image Content</w:t>
+      </w:r>
+      <w:r>
+        <w:rPr>
+          <w:lang w:val="en_US" w:bidi="en_US"/>
+        </w:rPr>
+      </w:r>
+    </w:p>
+    <w:p>
+      <w:pPr/>
+      <w:r>
+        <w:rPr>
+          <w:lang w:val="en_US" w:bidi="en_US"/>
+        </w:rPr>
+      </w:r>
+    </w:p>
+    <w:p>
+      <w:r>
+        <w:drawing>
+          <wp:inline xmlns:a="http://schemas.openxmlformats.org/drawingml/2006/main" xmlns:pic="http://schemas.openxmlformats.org/drawingml/2006/picture">
+            <wp:extent cx="6096000" cy="6457627"/>
+            <wp:docPr id="10" name="Picture 10"/>
+            <wp:cNvGraphicFramePr>
+              <a:graphicFrameLocks noChangeAspect="1"/>
+            </wp:cNvGraphicFramePr>
+            <a:graphic>
+              <a:graphicData uri="http://schemas.openxmlformats.org/drawingml/2006/picture">
+                <pic:pic>
+                  <pic:nvPicPr>
+                    <pic:cNvPr id="0" name="image.jpg"/>
+                    <pic:cNvPicPr/>
+                  </pic:nvPicPr>
+                  <pic:blipFill>
+                    <a:blip r:embed="rId31"/>
+                    <a:stretch>
+                      <a:fillRect/>
+                    </a:stretch>
+                  </pic:blipFill>
+                  <pic:spPr>
+                    <a:xfrm>
+                      <a:off x="0" y="0"/>
+                      <a:ext cx="6096000" cy="6457627"/>
+                    </a:xfrm>
+                    <a:prstGeom prst="rect"/>
+                  </pic:spPr>
+                </pic:pic>
+              </a:graphicData>
+            </a:graphic>
+          </wp:inline>
+        </w:drawing>
+      </w:r>
+    </w:p>
+    <w:p>
+      <w:pPr/>
+      <w:r>
+        <w:rPr>
+          <w:lang w:val="en_US" w:bidi="en_US"/>
+        </w:rPr>
+      </w:r>
+      <w:hyperlink r:id="rId32">
+        <w:r>
+          <w:rPr>
+            <w:lang w:val="en_US" w:bidi="en_US"/>
+          </w:rPr>
+          <w:rPr>
+            <w:color w:val="0000EE"/>
+            <w:u w:val="single"/>
+          </w:rPr>
+          <w:t>link</w:t>
+        </w:r>
+      </w:hyperlink>
+      <w:r>
+        <w:rPr>
+          <w:lang w:val="en_US" w:bidi="en_US"/>
+        </w:rPr>
+      </w:r>
+      <w:r>
+        <w:rPr>
+          <w:lang w:val="en_US" w:bidi="en_US"/>
+        </w:rPr>
+      </w:r>
+    </w:p>
+    <w:p>
+      <w:pPr/>
+      <w:r>
+        <w:rPr>
+          <w:lang w:val="en_US" w:bidi="en_US"/>
+        </w:rPr>
+      </w:r>
+    </w:p>
+    <w:p>
+      <w:pPr>
+        <w:pStyle w:val="Heading2"/>
+      </w:pPr>
+      <w:r>
+        <w:rPr>
+          <w:lang w:val="en_US" w:bidi="en_US"/>
+        </w:rPr>
         <w:t>Iron Gate</w:t>
       </w:r>
       <w:r>
@@ -957,6 +1348,11 @@
         </w:rPr>
         <w:t>Image Content</w:t>
       </w:r>
+      <w:r>
+        <w:rPr>
+          <w:lang w:val="en_US" w:bidi="en_US"/>
+        </w:rPr>
+      </w:r>
     </w:p>
     <w:p>
       <w:pPr/>
@@ -967,11 +1363,39 @@
       </w:r>
     </w:p>
     <w:p>
-      <w:r/>
-    </w:p>
-    <w:p>
-      <w:r>
-        <w:t>&lt;image: https://cdn.aquifer.bible/aquifer-content/resources/FIAImages/iron-gate.jpg&gt;</w:t>
+      <w:r>
+        <w:drawing>
+          <wp:inline xmlns:a="http://schemas.openxmlformats.org/drawingml/2006/main" xmlns:pic="http://schemas.openxmlformats.org/drawingml/2006/picture">
+            <wp:extent cx="6096000" cy="3432048"/>
+            <wp:docPr id="11" name="Picture 11"/>
+            <wp:cNvGraphicFramePr>
+              <a:graphicFrameLocks noChangeAspect="1"/>
+            </wp:cNvGraphicFramePr>
+            <a:graphic>
+              <a:graphicData uri="http://schemas.openxmlformats.org/drawingml/2006/picture">
+                <pic:pic>
+                  <pic:nvPicPr>
+                    <pic:cNvPr id="0" name="image.jpg"/>
+                    <pic:cNvPicPr/>
+                  </pic:nvPicPr>
+                  <pic:blipFill>
+                    <a:blip r:embed="rId33"/>
+                    <a:stretch>
+                      <a:fillRect/>
+                    </a:stretch>
+                  </pic:blipFill>
+                  <pic:spPr>
+                    <a:xfrm>
+                      <a:off x="0" y="0"/>
+                      <a:ext cx="6096000" cy="3432048"/>
+                    </a:xfrm>
+                    <a:prstGeom prst="rect"/>
+                  </pic:spPr>
+                </pic:pic>
+              </a:graphicData>
+            </a:graphic>
+          </wp:inline>
+        </w:drawing>
       </w:r>
     </w:p>
     <w:p>
@@ -981,7 +1405,1375 @@
           <w:lang w:val="en_US" w:bidi="en_US"/>
         </w:rPr>
       </w:r>
-      <w:hyperlink r:id="rId22">
+      <w:hyperlink r:id="rId34">
+        <w:r>
+          <w:rPr>
+            <w:lang w:val="en_US" w:bidi="en_US"/>
+          </w:rPr>
+          <w:rPr>
+            <w:color w:val="0000EE"/>
+            <w:u w:val="single"/>
+          </w:rPr>
+          <w:t>link</w:t>
+        </w:r>
+      </w:hyperlink>
+      <w:r>
+        <w:rPr>
+          <w:lang w:val="en_US" w:bidi="en_US"/>
+        </w:rPr>
+      </w:r>
+      <w:r>
+        <w:rPr>
+          <w:lang w:val="en_US" w:bidi="en_US"/>
+        </w:rPr>
+      </w:r>
+    </w:p>
+    <w:p>
+      <w:pPr/>
+      <w:r>
+        <w:rPr>
+          <w:lang w:val="en_US" w:bidi="en_US"/>
+        </w:rPr>
+      </w:r>
+    </w:p>
+    <w:p>
+      <w:pPr>
+        <w:pStyle w:val="Heading2"/>
+      </w:pPr>
+      <w:r>
+        <w:rPr>
+          <w:lang w:val="en_US" w:bidi="en_US"/>
+        </w:rPr>
+        <w:t>Iron Gate</w:t>
+      </w:r>
+      <w:r>
+        <w:rPr>
+          <w:lang w:val="en_US" w:bidi="en_US"/>
+        </w:rPr>
+      </w:r>
+    </w:p>
+    <w:p>
+      <w:pPr>
+        <w:pStyle w:val="Heading4"/>
+      </w:pPr>
+      <w:r>
+        <w:rPr>
+          <w:lang w:val="en_US" w:bidi="en_US"/>
+        </w:rPr>
+        <w:t>Image Content</w:t>
+      </w:r>
+      <w:r>
+        <w:rPr>
+          <w:lang w:val="en_US" w:bidi="en_US"/>
+        </w:rPr>
+      </w:r>
+    </w:p>
+    <w:p>
+      <w:pPr/>
+      <w:r>
+        <w:rPr>
+          <w:lang w:val="en_US" w:bidi="en_US"/>
+        </w:rPr>
+      </w:r>
+    </w:p>
+    <w:p>
+      <w:r>
+        <w:drawing>
+          <wp:inline xmlns:a="http://schemas.openxmlformats.org/drawingml/2006/main" xmlns:pic="http://schemas.openxmlformats.org/drawingml/2006/picture">
+            <wp:extent cx="6096000" cy="3432048"/>
+            <wp:docPr id="12" name="Picture 12"/>
+            <wp:cNvGraphicFramePr>
+              <a:graphicFrameLocks noChangeAspect="1"/>
+            </wp:cNvGraphicFramePr>
+            <a:graphic>
+              <a:graphicData uri="http://schemas.openxmlformats.org/drawingml/2006/picture">
+                <pic:pic>
+                  <pic:nvPicPr>
+                    <pic:cNvPr id="0" name="image.jpg"/>
+                    <pic:cNvPicPr/>
+                  </pic:nvPicPr>
+                  <pic:blipFill>
+                    <a:blip r:embed="rId35"/>
+                    <a:stretch>
+                      <a:fillRect/>
+                    </a:stretch>
+                  </pic:blipFill>
+                  <pic:spPr>
+                    <a:xfrm>
+                      <a:off x="0" y="0"/>
+                      <a:ext cx="6096000" cy="3432048"/>
+                    </a:xfrm>
+                    <a:prstGeom prst="rect"/>
+                  </pic:spPr>
+                </pic:pic>
+              </a:graphicData>
+            </a:graphic>
+          </wp:inline>
+        </w:drawing>
+      </w:r>
+    </w:p>
+    <w:p>
+      <w:pPr/>
+      <w:r>
+        <w:rPr>
+          <w:lang w:val="en_US" w:bidi="en_US"/>
+        </w:rPr>
+      </w:r>
+      <w:hyperlink r:id="rId36">
+        <w:r>
+          <w:rPr>
+            <w:lang w:val="en_US" w:bidi="en_US"/>
+          </w:rPr>
+          <w:rPr>
+            <w:color w:val="0000EE"/>
+            <w:u w:val="single"/>
+          </w:rPr>
+          <w:t>link</w:t>
+        </w:r>
+      </w:hyperlink>
+      <w:r>
+        <w:rPr>
+          <w:lang w:val="en_US" w:bidi="en_US"/>
+        </w:rPr>
+      </w:r>
+      <w:r>
+        <w:rPr>
+          <w:lang w:val="en_US" w:bidi="en_US"/>
+        </w:rPr>
+      </w:r>
+    </w:p>
+    <w:p>
+      <w:pPr/>
+      <w:r>
+        <w:rPr>
+          <w:lang w:val="en_US" w:bidi="en_US"/>
+        </w:rPr>
+      </w:r>
+    </w:p>
+    <w:p>
+      <w:pPr>
+        <w:pStyle w:val="Heading2"/>
+      </w:pPr>
+      <w:r>
+        <w:rPr>
+          <w:lang w:val="en_US" w:bidi="en_US"/>
+        </w:rPr>
+        <w:t>Iron Gate</w:t>
+      </w:r>
+      <w:r>
+        <w:rPr>
+          <w:lang w:val="en_US" w:bidi="en_US"/>
+        </w:rPr>
+      </w:r>
+    </w:p>
+    <w:p>
+      <w:pPr>
+        <w:pStyle w:val="Heading4"/>
+      </w:pPr>
+      <w:r>
+        <w:rPr>
+          <w:lang w:val="en_US" w:bidi="en_US"/>
+        </w:rPr>
+        <w:t>Image Content</w:t>
+      </w:r>
+      <w:r>
+        <w:rPr>
+          <w:lang w:val="en_US" w:bidi="en_US"/>
+        </w:rPr>
+      </w:r>
+    </w:p>
+    <w:p>
+      <w:pPr/>
+      <w:r>
+        <w:rPr>
+          <w:lang w:val="en_US" w:bidi="en_US"/>
+        </w:rPr>
+      </w:r>
+    </w:p>
+    <w:p>
+      <w:r>
+        <w:drawing>
+          <wp:inline xmlns:a="http://schemas.openxmlformats.org/drawingml/2006/main" xmlns:pic="http://schemas.openxmlformats.org/drawingml/2006/picture">
+            <wp:extent cx="6096000" cy="3432048"/>
+            <wp:docPr id="13" name="Picture 13"/>
+            <wp:cNvGraphicFramePr>
+              <a:graphicFrameLocks noChangeAspect="1"/>
+            </wp:cNvGraphicFramePr>
+            <a:graphic>
+              <a:graphicData uri="http://schemas.openxmlformats.org/drawingml/2006/picture">
+                <pic:pic>
+                  <pic:nvPicPr>
+                    <pic:cNvPr id="0" name="image.jpg"/>
+                    <pic:cNvPicPr/>
+                  </pic:nvPicPr>
+                  <pic:blipFill>
+                    <a:blip r:embed="rId37"/>
+                    <a:stretch>
+                      <a:fillRect/>
+                    </a:stretch>
+                  </pic:blipFill>
+                  <pic:spPr>
+                    <a:xfrm>
+                      <a:off x="0" y="0"/>
+                      <a:ext cx="6096000" cy="3432048"/>
+                    </a:xfrm>
+                    <a:prstGeom prst="rect"/>
+                  </pic:spPr>
+                </pic:pic>
+              </a:graphicData>
+            </a:graphic>
+          </wp:inline>
+        </w:drawing>
+      </w:r>
+    </w:p>
+    <w:p>
+      <w:pPr/>
+      <w:r>
+        <w:rPr>
+          <w:lang w:val="en_US" w:bidi="en_US"/>
+        </w:rPr>
+      </w:r>
+      <w:hyperlink r:id="rId38">
+        <w:r>
+          <w:rPr>
+            <w:lang w:val="en_US" w:bidi="en_US"/>
+          </w:rPr>
+          <w:rPr>
+            <w:color w:val="0000EE"/>
+            <w:u w:val="single"/>
+          </w:rPr>
+          <w:t>link</w:t>
+        </w:r>
+      </w:hyperlink>
+      <w:r>
+        <w:rPr>
+          <w:lang w:val="en_US" w:bidi="en_US"/>
+        </w:rPr>
+      </w:r>
+      <w:r>
+        <w:rPr>
+          <w:lang w:val="en_US" w:bidi="en_US"/>
+        </w:rPr>
+      </w:r>
+    </w:p>
+    <w:p>
+      <w:pPr/>
+      <w:r>
+        <w:rPr>
+          <w:lang w:val="en_US" w:bidi="en_US"/>
+        </w:rPr>
+      </w:r>
+    </w:p>
+    <w:p>
+      <w:pPr>
+        <w:pStyle w:val="Heading2"/>
+      </w:pPr>
+      <w:r>
+        <w:rPr>
+          <w:lang w:val="en_US" w:bidi="en_US"/>
+        </w:rPr>
+        <w:t>Iron Gate</w:t>
+      </w:r>
+      <w:r>
+        <w:rPr>
+          <w:lang w:val="en_US" w:bidi="en_US"/>
+        </w:rPr>
+      </w:r>
+    </w:p>
+    <w:p>
+      <w:pPr>
+        <w:pStyle w:val="Heading4"/>
+      </w:pPr>
+      <w:r>
+        <w:rPr>
+          <w:lang w:val="en_US" w:bidi="en_US"/>
+        </w:rPr>
+        <w:t>Image Content</w:t>
+      </w:r>
+      <w:r>
+        <w:rPr>
+          <w:lang w:val="en_US" w:bidi="en_US"/>
+        </w:rPr>
+      </w:r>
+    </w:p>
+    <w:p>
+      <w:pPr/>
+      <w:r>
+        <w:rPr>
+          <w:lang w:val="en_US" w:bidi="en_US"/>
+        </w:rPr>
+      </w:r>
+    </w:p>
+    <w:p>
+      <w:r>
+        <w:drawing>
+          <wp:inline xmlns:a="http://schemas.openxmlformats.org/drawingml/2006/main" xmlns:pic="http://schemas.openxmlformats.org/drawingml/2006/picture">
+            <wp:extent cx="6096000" cy="4090416"/>
+            <wp:docPr id="14" name="Picture 14"/>
+            <wp:cNvGraphicFramePr>
+              <a:graphicFrameLocks noChangeAspect="1"/>
+            </wp:cNvGraphicFramePr>
+            <a:graphic>
+              <a:graphicData uri="http://schemas.openxmlformats.org/drawingml/2006/picture">
+                <pic:pic>
+                  <pic:nvPicPr>
+                    <pic:cNvPr id="0" name="image.jpg"/>
+                    <pic:cNvPicPr/>
+                  </pic:nvPicPr>
+                  <pic:blipFill>
+                    <a:blip r:embed="rId39"/>
+                    <a:stretch>
+                      <a:fillRect/>
+                    </a:stretch>
+                  </pic:blipFill>
+                  <pic:spPr>
+                    <a:xfrm>
+                      <a:off x="0" y="0"/>
+                      <a:ext cx="6096000" cy="4090416"/>
+                    </a:xfrm>
+                    <a:prstGeom prst="rect"/>
+                  </pic:spPr>
+                </pic:pic>
+              </a:graphicData>
+            </a:graphic>
+          </wp:inline>
+        </w:drawing>
+      </w:r>
+    </w:p>
+    <w:p>
+      <w:pPr/>
+      <w:r>
+        <w:rPr>
+          <w:lang w:val="en_US" w:bidi="en_US"/>
+        </w:rPr>
+      </w:r>
+      <w:hyperlink r:id="rId40">
+        <w:r>
+          <w:rPr>
+            <w:lang w:val="en_US" w:bidi="en_US"/>
+          </w:rPr>
+          <w:rPr>
+            <w:color w:val="0000EE"/>
+            <w:u w:val="single"/>
+          </w:rPr>
+          <w:t>link</w:t>
+        </w:r>
+      </w:hyperlink>
+      <w:r>
+        <w:rPr>
+          <w:lang w:val="en_US" w:bidi="en_US"/>
+        </w:rPr>
+      </w:r>
+      <w:r>
+        <w:rPr>
+          <w:lang w:val="en_US" w:bidi="en_US"/>
+        </w:rPr>
+      </w:r>
+    </w:p>
+    <w:p>
+      <w:pPr/>
+      <w:r>
+        <w:rPr>
+          <w:lang w:val="en_US" w:bidi="en_US"/>
+        </w:rPr>
+      </w:r>
+    </w:p>
+    <w:p>
+      <w:pPr>
+        <w:pStyle w:val="Heading2"/>
+      </w:pPr>
+      <w:r>
+        <w:rPr>
+          <w:lang w:val="en_US" w:bidi="en_US"/>
+        </w:rPr>
+        <w:t>Iron Gate</w:t>
+      </w:r>
+      <w:r>
+        <w:rPr>
+          <w:lang w:val="en_US" w:bidi="en_US"/>
+        </w:rPr>
+      </w:r>
+    </w:p>
+    <w:p>
+      <w:pPr>
+        <w:pStyle w:val="Heading4"/>
+      </w:pPr>
+      <w:r>
+        <w:rPr>
+          <w:lang w:val="en_US" w:bidi="en_US"/>
+        </w:rPr>
+        <w:t>Image Content</w:t>
+      </w:r>
+      <w:r>
+        <w:rPr>
+          <w:lang w:val="en_US" w:bidi="en_US"/>
+        </w:rPr>
+      </w:r>
+    </w:p>
+    <w:p>
+      <w:pPr/>
+      <w:r>
+        <w:rPr>
+          <w:lang w:val="en_US" w:bidi="en_US"/>
+        </w:rPr>
+      </w:r>
+    </w:p>
+    <w:p>
+      <w:r>
+        <w:drawing>
+          <wp:inline xmlns:a="http://schemas.openxmlformats.org/drawingml/2006/main" xmlns:pic="http://schemas.openxmlformats.org/drawingml/2006/picture">
+            <wp:extent cx="6096000" cy="4090416"/>
+            <wp:docPr id="15" name="Picture 15"/>
+            <wp:cNvGraphicFramePr>
+              <a:graphicFrameLocks noChangeAspect="1"/>
+            </wp:cNvGraphicFramePr>
+            <a:graphic>
+              <a:graphicData uri="http://schemas.openxmlformats.org/drawingml/2006/picture">
+                <pic:pic>
+                  <pic:nvPicPr>
+                    <pic:cNvPr id="0" name="image.jpg"/>
+                    <pic:cNvPicPr/>
+                  </pic:nvPicPr>
+                  <pic:blipFill>
+                    <a:blip r:embed="rId41"/>
+                    <a:stretch>
+                      <a:fillRect/>
+                    </a:stretch>
+                  </pic:blipFill>
+                  <pic:spPr>
+                    <a:xfrm>
+                      <a:off x="0" y="0"/>
+                      <a:ext cx="6096000" cy="4090416"/>
+                    </a:xfrm>
+                    <a:prstGeom prst="rect"/>
+                  </pic:spPr>
+                </pic:pic>
+              </a:graphicData>
+            </a:graphic>
+          </wp:inline>
+        </w:drawing>
+      </w:r>
+    </w:p>
+    <w:p>
+      <w:pPr/>
+      <w:r>
+        <w:rPr>
+          <w:lang w:val="en_US" w:bidi="en_US"/>
+        </w:rPr>
+      </w:r>
+      <w:hyperlink r:id="rId42">
+        <w:r>
+          <w:rPr>
+            <w:lang w:val="en_US" w:bidi="en_US"/>
+          </w:rPr>
+          <w:rPr>
+            <w:color w:val="0000EE"/>
+            <w:u w:val="single"/>
+          </w:rPr>
+          <w:t>link</w:t>
+        </w:r>
+      </w:hyperlink>
+      <w:r>
+        <w:rPr>
+          <w:lang w:val="en_US" w:bidi="en_US"/>
+        </w:rPr>
+      </w:r>
+      <w:r>
+        <w:rPr>
+          <w:lang w:val="en_US" w:bidi="en_US"/>
+        </w:rPr>
+      </w:r>
+    </w:p>
+    <w:p>
+      <w:pPr/>
+      <w:r>
+        <w:rPr>
+          <w:lang w:val="en_US" w:bidi="en_US"/>
+        </w:rPr>
+      </w:r>
+    </w:p>
+    <w:p>
+      <w:pPr>
+        <w:pStyle w:val="Heading2"/>
+      </w:pPr>
+      <w:r>
+        <w:rPr>
+          <w:lang w:val="en_US" w:bidi="en_US"/>
+        </w:rPr>
+        <w:t>Iron Gate</w:t>
+      </w:r>
+      <w:r>
+        <w:rPr>
+          <w:lang w:val="en_US" w:bidi="en_US"/>
+        </w:rPr>
+      </w:r>
+    </w:p>
+    <w:p>
+      <w:pPr>
+        <w:pStyle w:val="Heading4"/>
+      </w:pPr>
+      <w:r>
+        <w:rPr>
+          <w:lang w:val="en_US" w:bidi="en_US"/>
+        </w:rPr>
+        <w:t>Image Content</w:t>
+      </w:r>
+      <w:r>
+        <w:rPr>
+          <w:lang w:val="en_US" w:bidi="en_US"/>
+        </w:rPr>
+      </w:r>
+    </w:p>
+    <w:p>
+      <w:pPr/>
+      <w:r>
+        <w:rPr>
+          <w:lang w:val="en_US" w:bidi="en_US"/>
+        </w:rPr>
+      </w:r>
+    </w:p>
+    <w:p>
+      <w:r>
+        <w:drawing>
+          <wp:inline xmlns:a="http://schemas.openxmlformats.org/drawingml/2006/main" xmlns:pic="http://schemas.openxmlformats.org/drawingml/2006/picture">
+            <wp:extent cx="6096000" cy="4090416"/>
+            <wp:docPr id="16" name="Picture 16"/>
+            <wp:cNvGraphicFramePr>
+              <a:graphicFrameLocks noChangeAspect="1"/>
+            </wp:cNvGraphicFramePr>
+            <a:graphic>
+              <a:graphicData uri="http://schemas.openxmlformats.org/drawingml/2006/picture">
+                <pic:pic>
+                  <pic:nvPicPr>
+                    <pic:cNvPr id="0" name="image.jpg"/>
+                    <pic:cNvPicPr/>
+                  </pic:nvPicPr>
+                  <pic:blipFill>
+                    <a:blip r:embed="rId43"/>
+                    <a:stretch>
+                      <a:fillRect/>
+                    </a:stretch>
+                  </pic:blipFill>
+                  <pic:spPr>
+                    <a:xfrm>
+                      <a:off x="0" y="0"/>
+                      <a:ext cx="6096000" cy="4090416"/>
+                    </a:xfrm>
+                    <a:prstGeom prst="rect"/>
+                  </pic:spPr>
+                </pic:pic>
+              </a:graphicData>
+            </a:graphic>
+          </wp:inline>
+        </w:drawing>
+      </w:r>
+    </w:p>
+    <w:p>
+      <w:pPr/>
+      <w:r>
+        <w:rPr>
+          <w:lang w:val="en_US" w:bidi="en_US"/>
+        </w:rPr>
+      </w:r>
+      <w:hyperlink r:id="rId44">
+        <w:r>
+          <w:rPr>
+            <w:lang w:val="en_US" w:bidi="en_US"/>
+          </w:rPr>
+          <w:rPr>
+            <w:color w:val="0000EE"/>
+            <w:u w:val="single"/>
+          </w:rPr>
+          <w:t>link</w:t>
+        </w:r>
+      </w:hyperlink>
+      <w:r>
+        <w:rPr>
+          <w:lang w:val="en_US" w:bidi="en_US"/>
+        </w:rPr>
+      </w:r>
+      <w:r>
+        <w:rPr>
+          <w:lang w:val="en_US" w:bidi="en_US"/>
+        </w:rPr>
+      </w:r>
+    </w:p>
+    <w:p>
+      <w:pPr/>
+      <w:r>
+        <w:rPr>
+          <w:lang w:val="en_US" w:bidi="en_US"/>
+        </w:rPr>
+      </w:r>
+    </w:p>
+    <w:p>
+      <w:pPr>
+        <w:pStyle w:val="Heading2"/>
+      </w:pPr>
+      <w:r>
+        <w:rPr>
+          <w:lang w:val="en_US" w:bidi="en_US"/>
+        </w:rPr>
+        <w:t>Israelite Soldier Wearing a Sword</w:t>
+      </w:r>
+      <w:r>
+        <w:rPr>
+          <w:lang w:val="en_US" w:bidi="en_US"/>
+        </w:rPr>
+      </w:r>
+    </w:p>
+    <w:p>
+      <w:pPr>
+        <w:pStyle w:val="Heading4"/>
+      </w:pPr>
+      <w:r>
+        <w:rPr>
+          <w:lang w:val="en_US" w:bidi="en_US"/>
+        </w:rPr>
+        <w:t>Image Content</w:t>
+      </w:r>
+      <w:r>
+        <w:rPr>
+          <w:lang w:val="en_US" w:bidi="en_US"/>
+        </w:rPr>
+      </w:r>
+    </w:p>
+    <w:p>
+      <w:pPr/>
+      <w:r>
+        <w:rPr>
+          <w:lang w:val="en_US" w:bidi="en_US"/>
+        </w:rPr>
+      </w:r>
+    </w:p>
+    <w:p>
+      <w:r>
+        <w:drawing>
+          <wp:inline xmlns:a="http://schemas.openxmlformats.org/drawingml/2006/main" xmlns:pic="http://schemas.openxmlformats.org/drawingml/2006/picture">
+            <wp:extent cx="6096000" cy="8095618"/>
+            <wp:docPr id="17" name="Picture 17"/>
+            <wp:cNvGraphicFramePr>
+              <a:graphicFrameLocks noChangeAspect="1"/>
+            </wp:cNvGraphicFramePr>
+            <a:graphic>
+              <a:graphicData uri="http://schemas.openxmlformats.org/drawingml/2006/picture">
+                <pic:pic>
+                  <pic:nvPicPr>
+                    <pic:cNvPr id="0" name="image.jpg"/>
+                    <pic:cNvPicPr/>
+                  </pic:nvPicPr>
+                  <pic:blipFill>
+                    <a:blip r:embed="rId45"/>
+                    <a:stretch>
+                      <a:fillRect/>
+                    </a:stretch>
+                  </pic:blipFill>
+                  <pic:spPr>
+                    <a:xfrm>
+                      <a:off x="0" y="0"/>
+                      <a:ext cx="6096000" cy="8095618"/>
+                    </a:xfrm>
+                    <a:prstGeom prst="rect"/>
+                  </pic:spPr>
+                </pic:pic>
+              </a:graphicData>
+            </a:graphic>
+          </wp:inline>
+        </w:drawing>
+      </w:r>
+    </w:p>
+    <w:p>
+      <w:pPr/>
+      <w:r>
+        <w:rPr>
+          <w:lang w:val="en_US" w:bidi="en_US"/>
+        </w:rPr>
+      </w:r>
+      <w:hyperlink r:id="rId46">
+        <w:r>
+          <w:rPr>
+            <w:lang w:val="en_US" w:bidi="en_US"/>
+          </w:rPr>
+          <w:rPr>
+            <w:color w:val="0000EE"/>
+            <w:u w:val="single"/>
+          </w:rPr>
+          <w:t>link</w:t>
+        </w:r>
+      </w:hyperlink>
+      <w:r>
+        <w:rPr>
+          <w:lang w:val="en_US" w:bidi="en_US"/>
+        </w:rPr>
+      </w:r>
+      <w:r>
+        <w:rPr>
+          <w:lang w:val="en_US" w:bidi="en_US"/>
+        </w:rPr>
+      </w:r>
+    </w:p>
+    <w:p>
+      <w:pPr/>
+      <w:r>
+        <w:rPr>
+          <w:lang w:val="en_US" w:bidi="en_US"/>
+        </w:rPr>
+      </w:r>
+    </w:p>
+    <w:p>
+      <w:pPr>
+        <w:pStyle w:val="Heading2"/>
+      </w:pPr>
+      <w:r>
+        <w:rPr>
+          <w:lang w:val="en_US" w:bidi="en_US"/>
+        </w:rPr>
+        <w:t>Israelite Soldier Wearing a Sword</w:t>
+      </w:r>
+      <w:r>
+        <w:rPr>
+          <w:lang w:val="en_US" w:bidi="en_US"/>
+        </w:rPr>
+      </w:r>
+    </w:p>
+    <w:p>
+      <w:pPr>
+        <w:pStyle w:val="Heading4"/>
+      </w:pPr>
+      <w:r>
+        <w:rPr>
+          <w:lang w:val="en_US" w:bidi="en_US"/>
+        </w:rPr>
+        <w:t>Image Content</w:t>
+      </w:r>
+      <w:r>
+        <w:rPr>
+          <w:lang w:val="en_US" w:bidi="en_US"/>
+        </w:rPr>
+      </w:r>
+    </w:p>
+    <w:p>
+      <w:pPr/>
+      <w:r>
+        <w:rPr>
+          <w:lang w:val="en_US" w:bidi="en_US"/>
+        </w:rPr>
+      </w:r>
+    </w:p>
+    <w:p>
+      <w:r>
+        <w:drawing>
+          <wp:inline xmlns:a="http://schemas.openxmlformats.org/drawingml/2006/main" xmlns:pic="http://schemas.openxmlformats.org/drawingml/2006/picture">
+            <wp:extent cx="6096000" cy="11124088"/>
+            <wp:docPr id="18" name="Picture 18"/>
+            <wp:cNvGraphicFramePr>
+              <a:graphicFrameLocks noChangeAspect="1"/>
+            </wp:cNvGraphicFramePr>
+            <a:graphic>
+              <a:graphicData uri="http://schemas.openxmlformats.org/drawingml/2006/picture">
+                <pic:pic>
+                  <pic:nvPicPr>
+                    <pic:cNvPr id="0" name="image.jpg"/>
+                    <pic:cNvPicPr/>
+                  </pic:nvPicPr>
+                  <pic:blipFill>
+                    <a:blip r:embed="rId47"/>
+                    <a:stretch>
+                      <a:fillRect/>
+                    </a:stretch>
+                  </pic:blipFill>
+                  <pic:spPr>
+                    <a:xfrm>
+                      <a:off x="0" y="0"/>
+                      <a:ext cx="6096000" cy="11124088"/>
+                    </a:xfrm>
+                    <a:prstGeom prst="rect"/>
+                  </pic:spPr>
+                </pic:pic>
+              </a:graphicData>
+            </a:graphic>
+          </wp:inline>
+        </w:drawing>
+      </w:r>
+    </w:p>
+    <w:p>
+      <w:pPr/>
+      <w:r>
+        <w:rPr>
+          <w:lang w:val="en_US" w:bidi="en_US"/>
+        </w:rPr>
+      </w:r>
+      <w:hyperlink r:id="rId48">
+        <w:r>
+          <w:rPr>
+            <w:lang w:val="en_US" w:bidi="en_US"/>
+          </w:rPr>
+          <w:rPr>
+            <w:color w:val="0000EE"/>
+            <w:u w:val="single"/>
+          </w:rPr>
+          <w:t>link</w:t>
+        </w:r>
+      </w:hyperlink>
+      <w:r>
+        <w:rPr>
+          <w:lang w:val="en_US" w:bidi="en_US"/>
+        </w:rPr>
+      </w:r>
+      <w:r>
+        <w:rPr>
+          <w:lang w:val="en_US" w:bidi="en_US"/>
+        </w:rPr>
+      </w:r>
+    </w:p>
+    <w:p>
+      <w:pPr/>
+      <w:r>
+        <w:rPr>
+          <w:lang w:val="en_US" w:bidi="en_US"/>
+        </w:rPr>
+      </w:r>
+    </w:p>
+    <w:p>
+      <w:pPr>
+        <w:pStyle w:val="Heading2"/>
+      </w:pPr>
+      <w:r>
+        <w:rPr>
+          <w:lang w:val="en_US" w:bidi="en_US"/>
+        </w:rPr>
+        <w:t>Israelite Soldier Wearing a Sword</w:t>
+      </w:r>
+      <w:r>
+        <w:rPr>
+          <w:lang w:val="en_US" w:bidi="en_US"/>
+        </w:rPr>
+      </w:r>
+    </w:p>
+    <w:p>
+      <w:pPr>
+        <w:pStyle w:val="Heading4"/>
+      </w:pPr>
+      <w:r>
+        <w:rPr>
+          <w:lang w:val="en_US" w:bidi="en_US"/>
+        </w:rPr>
+        <w:t>Image Content</w:t>
+      </w:r>
+      <w:r>
+        <w:rPr>
+          <w:lang w:val="en_US" w:bidi="en_US"/>
+        </w:rPr>
+      </w:r>
+    </w:p>
+    <w:p>
+      <w:pPr/>
+      <w:r>
+        <w:rPr>
+          <w:lang w:val="en_US" w:bidi="en_US"/>
+        </w:rPr>
+      </w:r>
+    </w:p>
+    <w:p>
+      <w:r>
+        <w:drawing>
+          <wp:inline xmlns:a="http://schemas.openxmlformats.org/drawingml/2006/main" xmlns:pic="http://schemas.openxmlformats.org/drawingml/2006/picture">
+            <wp:extent cx="6096000" cy="4066032"/>
+            <wp:docPr id="19" name="Picture 19"/>
+            <wp:cNvGraphicFramePr>
+              <a:graphicFrameLocks noChangeAspect="1"/>
+            </wp:cNvGraphicFramePr>
+            <a:graphic>
+              <a:graphicData uri="http://schemas.openxmlformats.org/drawingml/2006/picture">
+                <pic:pic>
+                  <pic:nvPicPr>
+                    <pic:cNvPr id="0" name="image.jpg"/>
+                    <pic:cNvPicPr/>
+                  </pic:nvPicPr>
+                  <pic:blipFill>
+                    <a:blip r:embed="rId49"/>
+                    <a:stretch>
+                      <a:fillRect/>
+                    </a:stretch>
+                  </pic:blipFill>
+                  <pic:spPr>
+                    <a:xfrm>
+                      <a:off x="0" y="0"/>
+                      <a:ext cx="6096000" cy="4066032"/>
+                    </a:xfrm>
+                    <a:prstGeom prst="rect"/>
+                  </pic:spPr>
+                </pic:pic>
+              </a:graphicData>
+            </a:graphic>
+          </wp:inline>
+        </w:drawing>
+      </w:r>
+    </w:p>
+    <w:p>
+      <w:pPr/>
+      <w:r>
+        <w:rPr>
+          <w:lang w:val="en_US" w:bidi="en_US"/>
+        </w:rPr>
+      </w:r>
+      <w:hyperlink r:id="rId50">
+        <w:r>
+          <w:rPr>
+            <w:lang w:val="en_US" w:bidi="en_US"/>
+          </w:rPr>
+          <w:rPr>
+            <w:color w:val="0000EE"/>
+            <w:u w:val="single"/>
+          </w:rPr>
+          <w:t>link</w:t>
+        </w:r>
+      </w:hyperlink>
+      <w:r>
+        <w:rPr>
+          <w:lang w:val="en_US" w:bidi="en_US"/>
+        </w:rPr>
+      </w:r>
+      <w:r>
+        <w:rPr>
+          <w:lang w:val="en_US" w:bidi="en_US"/>
+        </w:rPr>
+      </w:r>
+    </w:p>
+    <w:p>
+      <w:pPr/>
+      <w:r>
+        <w:rPr>
+          <w:lang w:val="en_US" w:bidi="en_US"/>
+        </w:rPr>
+      </w:r>
+    </w:p>
+    <w:p>
+      <w:pPr>
+        <w:pStyle w:val="Heading2"/>
+      </w:pPr>
+      <w:r>
+        <w:rPr>
+          <w:lang w:val="en_US" w:bidi="en_US"/>
+        </w:rPr>
+        <w:t>Israelites Camping Around Tabernacle</w:t>
+      </w:r>
+      <w:r>
+        <w:rPr>
+          <w:lang w:val="en_US" w:bidi="en_US"/>
+        </w:rPr>
+      </w:r>
+    </w:p>
+    <w:p>
+      <w:pPr>
+        <w:pStyle w:val="Heading4"/>
+      </w:pPr>
+      <w:r>
+        <w:rPr>
+          <w:lang w:val="en_US" w:bidi="en_US"/>
+        </w:rPr>
+        <w:t>Image Content</w:t>
+      </w:r>
+      <w:r>
+        <w:rPr>
+          <w:lang w:val="en_US" w:bidi="en_US"/>
+        </w:rPr>
+      </w:r>
+    </w:p>
+    <w:p>
+      <w:pPr/>
+      <w:r>
+        <w:rPr>
+          <w:lang w:val="en_US" w:bidi="en_US"/>
+        </w:rPr>
+      </w:r>
+    </w:p>
+    <w:p>
+      <w:r>
+        <w:drawing>
+          <wp:inline xmlns:a="http://schemas.openxmlformats.org/drawingml/2006/main" xmlns:pic="http://schemas.openxmlformats.org/drawingml/2006/picture">
+            <wp:extent cx="6096000" cy="3432048"/>
+            <wp:docPr id="20" name="Picture 20"/>
+            <wp:cNvGraphicFramePr>
+              <a:graphicFrameLocks noChangeAspect="1"/>
+            </wp:cNvGraphicFramePr>
+            <a:graphic>
+              <a:graphicData uri="http://schemas.openxmlformats.org/drawingml/2006/picture">
+                <pic:pic>
+                  <pic:nvPicPr>
+                    <pic:cNvPr id="0" name="image.jpg"/>
+                    <pic:cNvPicPr/>
+                  </pic:nvPicPr>
+                  <pic:blipFill>
+                    <a:blip r:embed="rId51"/>
+                    <a:stretch>
+                      <a:fillRect/>
+                    </a:stretch>
+                  </pic:blipFill>
+                  <pic:spPr>
+                    <a:xfrm>
+                      <a:off x="0" y="0"/>
+                      <a:ext cx="6096000" cy="3432048"/>
+                    </a:xfrm>
+                    <a:prstGeom prst="rect"/>
+                  </pic:spPr>
+                </pic:pic>
+              </a:graphicData>
+            </a:graphic>
+          </wp:inline>
+        </w:drawing>
+      </w:r>
+    </w:p>
+    <w:p>
+      <w:pPr/>
+      <w:r>
+        <w:rPr>
+          <w:lang w:val="en_US" w:bidi="en_US"/>
+        </w:rPr>
+      </w:r>
+      <w:hyperlink r:id="rId52">
+        <w:r>
+          <w:rPr>
+            <w:lang w:val="en_US" w:bidi="en_US"/>
+          </w:rPr>
+          <w:rPr>
+            <w:color w:val="0000EE"/>
+            <w:u w:val="single"/>
+          </w:rPr>
+          <w:t>link</w:t>
+        </w:r>
+      </w:hyperlink>
+      <w:r>
+        <w:rPr>
+          <w:lang w:val="en_US" w:bidi="en_US"/>
+        </w:rPr>
+      </w:r>
+      <w:r>
+        <w:rPr>
+          <w:lang w:val="en_US" w:bidi="en_US"/>
+        </w:rPr>
+      </w:r>
+    </w:p>
+    <w:p>
+      <w:pPr/>
+      <w:r>
+        <w:rPr>
+          <w:lang w:val="en_US" w:bidi="en_US"/>
+        </w:rPr>
+      </w:r>
+    </w:p>
+    <w:p>
+      <w:pPr>
+        <w:pStyle w:val="Heading2"/>
+      </w:pPr>
+      <w:r>
+        <w:rPr>
+          <w:lang w:val="en_US" w:bidi="en_US"/>
+        </w:rPr>
+        <w:t>Items of Gold, Silver and Bronze</w:t>
+      </w:r>
+      <w:r>
+        <w:rPr>
+          <w:lang w:val="en_US" w:bidi="en_US"/>
+        </w:rPr>
+      </w:r>
+    </w:p>
+    <w:p>
+      <w:pPr>
+        <w:pStyle w:val="Heading4"/>
+      </w:pPr>
+      <w:r>
+        <w:rPr>
+          <w:lang w:val="en_US" w:bidi="en_US"/>
+        </w:rPr>
+        <w:t>Image Content</w:t>
+      </w:r>
+      <w:r>
+        <w:rPr>
+          <w:lang w:val="en_US" w:bidi="en_US"/>
+        </w:rPr>
+      </w:r>
+    </w:p>
+    <w:p>
+      <w:pPr/>
+      <w:r>
+        <w:rPr>
+          <w:lang w:val="en_US" w:bidi="en_US"/>
+        </w:rPr>
+      </w:r>
+    </w:p>
+    <w:p>
+      <w:r>
+        <w:drawing>
+          <wp:inline xmlns:a="http://schemas.openxmlformats.org/drawingml/2006/main" xmlns:pic="http://schemas.openxmlformats.org/drawingml/2006/picture">
+            <wp:extent cx="6096000" cy="4322064"/>
+            <wp:docPr id="21" name="Picture 21"/>
+            <wp:cNvGraphicFramePr>
+              <a:graphicFrameLocks noChangeAspect="1"/>
+            </wp:cNvGraphicFramePr>
+            <a:graphic>
+              <a:graphicData uri="http://schemas.openxmlformats.org/drawingml/2006/picture">
+                <pic:pic>
+                  <pic:nvPicPr>
+                    <pic:cNvPr id="0" name="image.jpg"/>
+                    <pic:cNvPicPr/>
+                  </pic:nvPicPr>
+                  <pic:blipFill>
+                    <a:blip r:embed="rId53"/>
+                    <a:stretch>
+                      <a:fillRect/>
+                    </a:stretch>
+                  </pic:blipFill>
+                  <pic:spPr>
+                    <a:xfrm>
+                      <a:off x="0" y="0"/>
+                      <a:ext cx="6096000" cy="4322064"/>
+                    </a:xfrm>
+                    <a:prstGeom prst="rect"/>
+                  </pic:spPr>
+                </pic:pic>
+              </a:graphicData>
+            </a:graphic>
+          </wp:inline>
+        </w:drawing>
+      </w:r>
+    </w:p>
+    <w:p>
+      <w:pPr/>
+      <w:r>
+        <w:rPr>
+          <w:lang w:val="en_US" w:bidi="en_US"/>
+        </w:rPr>
+      </w:r>
+      <w:hyperlink r:id="rId54">
+        <w:r>
+          <w:rPr>
+            <w:lang w:val="en_US" w:bidi="en_US"/>
+          </w:rPr>
+          <w:rPr>
+            <w:color w:val="0000EE"/>
+            <w:u w:val="single"/>
+          </w:rPr>
+          <w:t>link</w:t>
+        </w:r>
+      </w:hyperlink>
+      <w:r>
+        <w:rPr>
+          <w:lang w:val="en_US" w:bidi="en_US"/>
+        </w:rPr>
+      </w:r>
+      <w:r>
+        <w:rPr>
+          <w:lang w:val="en_US" w:bidi="en_US"/>
+        </w:rPr>
+      </w:r>
+    </w:p>
+    <w:p>
+      <w:pPr/>
+      <w:r>
+        <w:rPr>
+          <w:lang w:val="en_US" w:bidi="en_US"/>
+        </w:rPr>
+      </w:r>
+    </w:p>
+    <w:p>
+      <w:pPr>
+        <w:pStyle w:val="Heading2"/>
+      </w:pPr>
+      <w:r>
+        <w:rPr>
+          <w:lang w:val="en_US" w:bidi="en_US"/>
+        </w:rPr>
+        <w:t>Items of Gold, Silver and Bronze</w:t>
+      </w:r>
+      <w:r>
+        <w:rPr>
+          <w:lang w:val="en_US" w:bidi="en_US"/>
+        </w:rPr>
+      </w:r>
+    </w:p>
+    <w:p>
+      <w:pPr>
+        <w:pStyle w:val="Heading4"/>
+      </w:pPr>
+      <w:r>
+        <w:rPr>
+          <w:lang w:val="en_US" w:bidi="en_US"/>
+        </w:rPr>
+        <w:t>Image Content</w:t>
+      </w:r>
+      <w:r>
+        <w:rPr>
+          <w:lang w:val="en_US" w:bidi="en_US"/>
+        </w:rPr>
+      </w:r>
+    </w:p>
+    <w:p>
+      <w:pPr/>
+      <w:r>
+        <w:rPr>
+          <w:lang w:val="en_US" w:bidi="en_US"/>
+        </w:rPr>
+      </w:r>
+    </w:p>
+    <w:p>
+      <w:r>
+        <w:drawing>
+          <wp:inline xmlns:a="http://schemas.openxmlformats.org/drawingml/2006/main" xmlns:pic="http://schemas.openxmlformats.org/drawingml/2006/picture">
+            <wp:extent cx="6096000" cy="8095618"/>
+            <wp:docPr id="22" name="Picture 22"/>
+            <wp:cNvGraphicFramePr>
+              <a:graphicFrameLocks noChangeAspect="1"/>
+            </wp:cNvGraphicFramePr>
+            <a:graphic>
+              <a:graphicData uri="http://schemas.openxmlformats.org/drawingml/2006/picture">
+                <pic:pic>
+                  <pic:nvPicPr>
+                    <pic:cNvPr id="0" name="image.jpg"/>
+                    <pic:cNvPicPr/>
+                  </pic:nvPicPr>
+                  <pic:blipFill>
+                    <a:blip r:embed="rId55"/>
+                    <a:stretch>
+                      <a:fillRect/>
+                    </a:stretch>
+                  </pic:blipFill>
+                  <pic:spPr>
+                    <a:xfrm>
+                      <a:off x="0" y="0"/>
+                      <a:ext cx="6096000" cy="8095618"/>
+                    </a:xfrm>
+                    <a:prstGeom prst="rect"/>
+                  </pic:spPr>
+                </pic:pic>
+              </a:graphicData>
+            </a:graphic>
+          </wp:inline>
+        </w:drawing>
+      </w:r>
+    </w:p>
+    <w:p>
+      <w:pPr/>
+      <w:r>
+        <w:rPr>
+          <w:lang w:val="en_US" w:bidi="en_US"/>
+        </w:rPr>
+      </w:r>
+      <w:hyperlink r:id="rId56">
+        <w:r>
+          <w:rPr>
+            <w:lang w:val="en_US" w:bidi="en_US"/>
+          </w:rPr>
+          <w:rPr>
+            <w:color w:val="0000EE"/>
+            <w:u w:val="single"/>
+          </w:rPr>
+          <w:t>link</w:t>
+        </w:r>
+      </w:hyperlink>
+      <w:r>
+        <w:rPr>
+          <w:lang w:val="en_US" w:bidi="en_US"/>
+        </w:rPr>
+      </w:r>
+      <w:r>
+        <w:rPr>
+          <w:lang w:val="en_US" w:bidi="en_US"/>
+        </w:rPr>
+      </w:r>
+    </w:p>
+    <w:p>
+      <w:pPr/>
+      <w:r>
+        <w:rPr>
+          <w:lang w:val="en_US" w:bidi="en_US"/>
+        </w:rPr>
+      </w:r>
+    </w:p>
+    <w:p>
+      <w:pPr>
+        <w:pStyle w:val="Heading2"/>
+      </w:pPr>
+      <w:r>
+        <w:rPr>
+          <w:lang w:val="en_US" w:bidi="en_US"/>
+        </w:rPr>
+        <w:t>Items of Gold, Silver and Bronze</w:t>
+      </w:r>
+      <w:r>
+        <w:rPr>
+          <w:lang w:val="en_US" w:bidi="en_US"/>
+        </w:rPr>
+      </w:r>
+    </w:p>
+    <w:p>
+      <w:pPr>
+        <w:pStyle w:val="Heading4"/>
+      </w:pPr>
+      <w:r>
+        <w:rPr>
+          <w:lang w:val="en_US" w:bidi="en_US"/>
+        </w:rPr>
+        <w:t>Image Content</w:t>
+      </w:r>
+      <w:r>
+        <w:rPr>
+          <w:lang w:val="en_US" w:bidi="en_US"/>
+        </w:rPr>
+      </w:r>
+    </w:p>
+    <w:p>
+      <w:pPr/>
+      <w:r>
+        <w:rPr>
+          <w:lang w:val="en_US" w:bidi="en_US"/>
+        </w:rPr>
+      </w:r>
+    </w:p>
+    <w:p>
+      <w:r>
+        <w:drawing>
+          <wp:inline xmlns:a="http://schemas.openxmlformats.org/drawingml/2006/main" xmlns:pic="http://schemas.openxmlformats.org/drawingml/2006/picture">
+            <wp:extent cx="6096000" cy="8095618"/>
+            <wp:docPr id="23" name="Picture 23"/>
+            <wp:cNvGraphicFramePr>
+              <a:graphicFrameLocks noChangeAspect="1"/>
+            </wp:cNvGraphicFramePr>
+            <a:graphic>
+              <a:graphicData uri="http://schemas.openxmlformats.org/drawingml/2006/picture">
+                <pic:pic>
+                  <pic:nvPicPr>
+                    <pic:cNvPr id="0" name="image.jpg"/>
+                    <pic:cNvPicPr/>
+                  </pic:nvPicPr>
+                  <pic:blipFill>
+                    <a:blip r:embed="rId57"/>
+                    <a:stretch>
+                      <a:fillRect/>
+                    </a:stretch>
+                  </pic:blipFill>
+                  <pic:spPr>
+                    <a:xfrm>
+                      <a:off x="0" y="0"/>
+                      <a:ext cx="6096000" cy="8095618"/>
+                    </a:xfrm>
+                    <a:prstGeom prst="rect"/>
+                  </pic:spPr>
+                </pic:pic>
+              </a:graphicData>
+            </a:graphic>
+          </wp:inline>
+        </w:drawing>
+      </w:r>
+    </w:p>
+    <w:p>
+      <w:pPr/>
+      <w:r>
+        <w:rPr>
+          <w:lang w:val="en_US" w:bidi="en_US"/>
+        </w:rPr>
+      </w:r>
+      <w:hyperlink r:id="rId58">
         <w:r>
           <w:rPr>
             <w:lang w:val="en_US" w:bidi="en_US"/>

</xml_diff>

<commit_message>
Updated Bible resource content for multiple languages for 2026-05-20 release
</commit_message>
<xml_diff>
--- a/eng/docx/009.content.docx
+++ b/eng/docx/009.content.docx
@@ -646,7 +646,7 @@
         <w:rPr>
           <w:lang w:val="en_US" w:bidi="en_US"/>
         </w:rPr>
-        <w:t>Inside of the Tabernacle</w:t>
+        <w:t>Inner Room</w:t>
       </w:r>
       <w:r>
         <w:rPr>
@@ -682,7 +682,7 @@
       <w:r>
         <w:drawing>
           <wp:inline xmlns:a="http://schemas.openxmlformats.org/drawingml/2006/main" xmlns:pic="http://schemas.openxmlformats.org/drawingml/2006/picture">
-            <wp:extent cx="6096000" cy="2560320"/>
+            <wp:extent cx="6096000" cy="4066032"/>
             <wp:docPr id="5" name="Picture 5"/>
             <wp:cNvGraphicFramePr>
               <a:graphicFrameLocks noChangeAspect="1"/>
@@ -703,7 +703,7 @@
                   <pic:spPr>
                     <a:xfrm>
                       <a:off x="0" y="0"/>
-                      <a:ext cx="6096000" cy="2560320"/>
+                      <a:ext cx="6096000" cy="4066032"/>
                     </a:xfrm>
                     <a:prstGeom prst="rect"/>
                   </pic:spPr>
@@ -760,7 +760,7 @@
         <w:rPr>
           <w:lang w:val="en_US" w:bidi="en_US"/>
         </w:rPr>
-        <w:t>Intestinal Worm</w:t>
+        <w:t>Inside of the Tabernacle</w:t>
       </w:r>
       <w:r>
         <w:rPr>
@@ -796,7 +796,7 @@
       <w:r>
         <w:drawing>
           <wp:inline xmlns:a="http://schemas.openxmlformats.org/drawingml/2006/main" xmlns:pic="http://schemas.openxmlformats.org/drawingml/2006/picture">
-            <wp:extent cx="6096000" cy="4413504"/>
+            <wp:extent cx="6096000" cy="2560320"/>
             <wp:docPr id="6" name="Picture 6"/>
             <wp:cNvGraphicFramePr>
               <a:graphicFrameLocks noChangeAspect="1"/>
@@ -817,7 +817,7 @@
                   <pic:spPr>
                     <a:xfrm>
                       <a:off x="0" y="0"/>
-                      <a:ext cx="6096000" cy="4413504"/>
+                      <a:ext cx="6096000" cy="2560320"/>
                     </a:xfrm>
                     <a:prstGeom prst="rect"/>
                   </pic:spPr>
@@ -874,7 +874,7 @@
         <w:rPr>
           <w:lang w:val="en_US" w:bidi="en_US"/>
         </w:rPr>
-        <w:t>Iron</w:t>
+        <w:t>Intestinal Worm</w:t>
       </w:r>
       <w:r>
         <w:rPr>
@@ -910,7 +910,7 @@
       <w:r>
         <w:drawing>
           <wp:inline xmlns:a="http://schemas.openxmlformats.org/drawingml/2006/main" xmlns:pic="http://schemas.openxmlformats.org/drawingml/2006/picture">
-            <wp:extent cx="6096000" cy="4066032"/>
+            <wp:extent cx="6096000" cy="4413504"/>
             <wp:docPr id="7" name="Picture 7"/>
             <wp:cNvGraphicFramePr>
               <a:graphicFrameLocks noChangeAspect="1"/>
@@ -931,7 +931,7 @@
                   <pic:spPr>
                     <a:xfrm>
                       <a:off x="0" y="0"/>
-                      <a:ext cx="6096000" cy="4066032"/>
+                      <a:ext cx="6096000" cy="4413504"/>
                     </a:xfrm>
                     <a:prstGeom prst="rect"/>
                   </pic:spPr>
@@ -1138,7 +1138,7 @@
       <w:r>
         <w:drawing>
           <wp:inline xmlns:a="http://schemas.openxmlformats.org/drawingml/2006/main" xmlns:pic="http://schemas.openxmlformats.org/drawingml/2006/picture">
-            <wp:extent cx="6096000" cy="3846576"/>
+            <wp:extent cx="6096000" cy="4066032"/>
             <wp:docPr id="9" name="Picture 9"/>
             <wp:cNvGraphicFramePr>
               <a:graphicFrameLocks noChangeAspect="1"/>
@@ -1159,7 +1159,7 @@
                   <pic:spPr>
                     <a:xfrm>
                       <a:off x="0" y="0"/>
-                      <a:ext cx="6096000" cy="3846576"/>
+                      <a:ext cx="6096000" cy="4066032"/>
                     </a:xfrm>
                     <a:prstGeom prst="rect"/>
                   </pic:spPr>
@@ -1252,7 +1252,7 @@
       <w:r>
         <w:drawing>
           <wp:inline xmlns:a="http://schemas.openxmlformats.org/drawingml/2006/main" xmlns:pic="http://schemas.openxmlformats.org/drawingml/2006/picture">
-            <wp:extent cx="6096000" cy="6457627"/>
+            <wp:extent cx="6096000" cy="3846576"/>
             <wp:docPr id="10" name="Picture 10"/>
             <wp:cNvGraphicFramePr>
               <a:graphicFrameLocks noChangeAspect="1"/>
@@ -1273,7 +1273,7 @@
                   <pic:spPr>
                     <a:xfrm>
                       <a:off x="0" y="0"/>
-                      <a:ext cx="6096000" cy="6457627"/>
+                      <a:ext cx="6096000" cy="3846576"/>
                     </a:xfrm>
                     <a:prstGeom prst="rect"/>
                   </pic:spPr>
@@ -1330,7 +1330,7 @@
         <w:rPr>
           <w:lang w:val="en_US" w:bidi="en_US"/>
         </w:rPr>
-        <w:t>Iron Gate</w:t>
+        <w:t>Iron</w:t>
       </w:r>
       <w:r>
         <w:rPr>
@@ -1366,7 +1366,7 @@
       <w:r>
         <w:drawing>
           <wp:inline xmlns:a="http://schemas.openxmlformats.org/drawingml/2006/main" xmlns:pic="http://schemas.openxmlformats.org/drawingml/2006/picture">
-            <wp:extent cx="6096000" cy="3432048"/>
+            <wp:extent cx="6096000" cy="6457627"/>
             <wp:docPr id="11" name="Picture 11"/>
             <wp:cNvGraphicFramePr>
               <a:graphicFrameLocks noChangeAspect="1"/>
@@ -1387,7 +1387,7 @@
                   <pic:spPr>
                     <a:xfrm>
                       <a:off x="0" y="0"/>
-                      <a:ext cx="6096000" cy="3432048"/>
+                      <a:ext cx="6096000" cy="6457627"/>
                     </a:xfrm>
                     <a:prstGeom prst="rect"/>
                   </pic:spPr>
@@ -1480,7 +1480,7 @@
       <w:r>
         <w:drawing>
           <wp:inline xmlns:a="http://schemas.openxmlformats.org/drawingml/2006/main" xmlns:pic="http://schemas.openxmlformats.org/drawingml/2006/picture">
-            <wp:extent cx="6096000" cy="3432048"/>
+            <wp:extent cx="6096000" cy="4090416"/>
             <wp:docPr id="12" name="Picture 12"/>
             <wp:cNvGraphicFramePr>
               <a:graphicFrameLocks noChangeAspect="1"/>
@@ -1501,7 +1501,7 @@
                   <pic:spPr>
                     <a:xfrm>
                       <a:off x="0" y="0"/>
-                      <a:ext cx="6096000" cy="3432048"/>
+                      <a:ext cx="6096000" cy="4090416"/>
                     </a:xfrm>
                     <a:prstGeom prst="rect"/>
                   </pic:spPr>
@@ -1594,7 +1594,7 @@
       <w:r>
         <w:drawing>
           <wp:inline xmlns:a="http://schemas.openxmlformats.org/drawingml/2006/main" xmlns:pic="http://schemas.openxmlformats.org/drawingml/2006/picture">
-            <wp:extent cx="6096000" cy="3432048"/>
+            <wp:extent cx="6096000" cy="4090416"/>
             <wp:docPr id="13" name="Picture 13"/>
             <wp:cNvGraphicFramePr>
               <a:graphicFrameLocks noChangeAspect="1"/>
@@ -1615,7 +1615,7 @@
                   <pic:spPr>
                     <a:xfrm>
                       <a:off x="0" y="0"/>
-                      <a:ext cx="6096000" cy="3432048"/>
+                      <a:ext cx="6096000" cy="4090416"/>
                     </a:xfrm>
                     <a:prstGeom prst="rect"/>
                   </pic:spPr>
@@ -1786,7 +1786,7 @@
         <w:rPr>
           <w:lang w:val="en_US" w:bidi="en_US"/>
         </w:rPr>
-        <w:t>Iron Gate</w:t>
+        <w:t>Israelite Soldier Wearing a Sword</w:t>
       </w:r>
       <w:r>
         <w:rPr>
@@ -1822,7 +1822,7 @@
       <w:r>
         <w:drawing>
           <wp:inline xmlns:a="http://schemas.openxmlformats.org/drawingml/2006/main" xmlns:pic="http://schemas.openxmlformats.org/drawingml/2006/picture">
-            <wp:extent cx="6096000" cy="4090416"/>
+            <wp:extent cx="6096000" cy="8095618"/>
             <wp:docPr id="15" name="Picture 15"/>
             <wp:cNvGraphicFramePr>
               <a:graphicFrameLocks noChangeAspect="1"/>
@@ -1843,7 +1843,7 @@
                   <pic:spPr>
                     <a:xfrm>
                       <a:off x="0" y="0"/>
-                      <a:ext cx="6096000" cy="4090416"/>
+                      <a:ext cx="6096000" cy="8095618"/>
                     </a:xfrm>
                     <a:prstGeom prst="rect"/>
                   </pic:spPr>
@@ -1900,7 +1900,7 @@
         <w:rPr>
           <w:lang w:val="en_US" w:bidi="en_US"/>
         </w:rPr>
-        <w:t>Iron Gate</w:t>
+        <w:t>Israelite Soldier Wearing a Sword</w:t>
       </w:r>
       <w:r>
         <w:rPr>
@@ -1936,7 +1936,7 @@
       <w:r>
         <w:drawing>
           <wp:inline xmlns:a="http://schemas.openxmlformats.org/drawingml/2006/main" xmlns:pic="http://schemas.openxmlformats.org/drawingml/2006/picture">
-            <wp:extent cx="6096000" cy="4090416"/>
+            <wp:extent cx="6096000" cy="11124088"/>
             <wp:docPr id="16" name="Picture 16"/>
             <wp:cNvGraphicFramePr>
               <a:graphicFrameLocks noChangeAspect="1"/>
@@ -1957,7 +1957,7 @@
                   <pic:spPr>
                     <a:xfrm>
                       <a:off x="0" y="0"/>
-                      <a:ext cx="6096000" cy="4090416"/>
+                      <a:ext cx="6096000" cy="11124088"/>
                     </a:xfrm>
                     <a:prstGeom prst="rect"/>
                   </pic:spPr>
@@ -2050,7 +2050,7 @@
       <w:r>
         <w:drawing>
           <wp:inline xmlns:a="http://schemas.openxmlformats.org/drawingml/2006/main" xmlns:pic="http://schemas.openxmlformats.org/drawingml/2006/picture">
-            <wp:extent cx="6096000" cy="8095618"/>
+            <wp:extent cx="6096000" cy="4066032"/>
             <wp:docPr id="17" name="Picture 17"/>
             <wp:cNvGraphicFramePr>
               <a:graphicFrameLocks noChangeAspect="1"/>
@@ -2071,7 +2071,7 @@
                   <pic:spPr>
                     <a:xfrm>
                       <a:off x="0" y="0"/>
-                      <a:ext cx="6096000" cy="8095618"/>
+                      <a:ext cx="6096000" cy="4066032"/>
                     </a:xfrm>
                     <a:prstGeom prst="rect"/>
                   </pic:spPr>
@@ -2128,7 +2128,7 @@
         <w:rPr>
           <w:lang w:val="en_US" w:bidi="en_US"/>
         </w:rPr>
-        <w:t>Israelite Soldier Wearing a Sword</w:t>
+        <w:t>Israelites Camping Around Tabernacle</w:t>
       </w:r>
       <w:r>
         <w:rPr>
@@ -2164,7 +2164,7 @@
       <w:r>
         <w:drawing>
           <wp:inline xmlns:a="http://schemas.openxmlformats.org/drawingml/2006/main" xmlns:pic="http://schemas.openxmlformats.org/drawingml/2006/picture">
-            <wp:extent cx="6096000" cy="11124088"/>
+            <wp:extent cx="6096000" cy="3432048"/>
             <wp:docPr id="18" name="Picture 18"/>
             <wp:cNvGraphicFramePr>
               <a:graphicFrameLocks noChangeAspect="1"/>
@@ -2185,7 +2185,7 @@
                   <pic:spPr>
                     <a:xfrm>
                       <a:off x="0" y="0"/>
-                      <a:ext cx="6096000" cy="11124088"/>
+                      <a:ext cx="6096000" cy="3432048"/>
                     </a:xfrm>
                     <a:prstGeom prst="rect"/>
                   </pic:spPr>
@@ -2242,7 +2242,7 @@
         <w:rPr>
           <w:lang w:val="en_US" w:bidi="en_US"/>
         </w:rPr>
-        <w:t>Israelite Soldier Wearing a Sword</w:t>
+        <w:t>Items of Gold, Silver and Bronze</w:t>
       </w:r>
       <w:r>
         <w:rPr>
@@ -2278,7 +2278,7 @@
       <w:r>
         <w:drawing>
           <wp:inline xmlns:a="http://schemas.openxmlformats.org/drawingml/2006/main" xmlns:pic="http://schemas.openxmlformats.org/drawingml/2006/picture">
-            <wp:extent cx="6096000" cy="4066032"/>
+            <wp:extent cx="6096000" cy="4322064"/>
             <wp:docPr id="19" name="Picture 19"/>
             <wp:cNvGraphicFramePr>
               <a:graphicFrameLocks noChangeAspect="1"/>
@@ -2299,7 +2299,7 @@
                   <pic:spPr>
                     <a:xfrm>
                       <a:off x="0" y="0"/>
-                      <a:ext cx="6096000" cy="4066032"/>
+                      <a:ext cx="6096000" cy="4322064"/>
                     </a:xfrm>
                     <a:prstGeom prst="rect"/>
                   </pic:spPr>
@@ -2356,7 +2356,7 @@
         <w:rPr>
           <w:lang w:val="en_US" w:bidi="en_US"/>
         </w:rPr>
-        <w:t>Israelites Camping Around Tabernacle</w:t>
+        <w:t>Items of Gold, Silver and Bronze</w:t>
       </w:r>
       <w:r>
         <w:rPr>
@@ -2392,7 +2392,7 @@
       <w:r>
         <w:drawing>
           <wp:inline xmlns:a="http://schemas.openxmlformats.org/drawingml/2006/main" xmlns:pic="http://schemas.openxmlformats.org/drawingml/2006/picture">
-            <wp:extent cx="6096000" cy="3432048"/>
+            <wp:extent cx="6096000" cy="8095618"/>
             <wp:docPr id="20" name="Picture 20"/>
             <wp:cNvGraphicFramePr>
               <a:graphicFrameLocks noChangeAspect="1"/>
@@ -2413,7 +2413,7 @@
                   <pic:spPr>
                     <a:xfrm>
                       <a:off x="0" y="0"/>
-                      <a:ext cx="6096000" cy="3432048"/>
+                      <a:ext cx="6096000" cy="8095618"/>
                     </a:xfrm>
                     <a:prstGeom prst="rect"/>
                   </pic:spPr>
@@ -2506,7 +2506,7 @@
       <w:r>
         <w:drawing>
           <wp:inline xmlns:a="http://schemas.openxmlformats.org/drawingml/2006/main" xmlns:pic="http://schemas.openxmlformats.org/drawingml/2006/picture">
-            <wp:extent cx="6096000" cy="4322064"/>
+            <wp:extent cx="6096000" cy="8095618"/>
             <wp:docPr id="21" name="Picture 21"/>
             <wp:cNvGraphicFramePr>
               <a:graphicFrameLocks noChangeAspect="1"/>
@@ -2527,120 +2527,6 @@
                   <pic:spPr>
                     <a:xfrm>
                       <a:off x="0" y="0"/>
-                      <a:ext cx="6096000" cy="4322064"/>
-                    </a:xfrm>
-                    <a:prstGeom prst="rect"/>
-                  </pic:spPr>
-                </pic:pic>
-              </a:graphicData>
-            </a:graphic>
-          </wp:inline>
-        </w:drawing>
-      </w:r>
-    </w:p>
-    <w:p>
-      <w:pPr/>
-      <w:r>
-        <w:rPr>
-          <w:lang w:val="en_US" w:bidi="en_US"/>
-        </w:rPr>
-      </w:r>
-      <w:hyperlink r:id="rId54">
-        <w:r>
-          <w:rPr>
-            <w:lang w:val="en_US" w:bidi="en_US"/>
-          </w:rPr>
-          <w:rPr>
-            <w:color w:val="0000EE"/>
-            <w:u w:val="single"/>
-          </w:rPr>
-          <w:t>link</w:t>
-        </w:r>
-      </w:hyperlink>
-      <w:r>
-        <w:rPr>
-          <w:lang w:val="en_US" w:bidi="en_US"/>
-        </w:rPr>
-      </w:r>
-      <w:r>
-        <w:rPr>
-          <w:lang w:val="en_US" w:bidi="en_US"/>
-        </w:rPr>
-      </w:r>
-    </w:p>
-    <w:p>
-      <w:pPr/>
-      <w:r>
-        <w:rPr>
-          <w:lang w:val="en_US" w:bidi="en_US"/>
-        </w:rPr>
-      </w:r>
-    </w:p>
-    <w:p>
-      <w:pPr>
-        <w:pStyle w:val="Heading2"/>
-      </w:pPr>
-      <w:r>
-        <w:rPr>
-          <w:lang w:val="en_US" w:bidi="en_US"/>
-        </w:rPr>
-        <w:t>Items of Gold, Silver and Bronze</w:t>
-      </w:r>
-      <w:r>
-        <w:rPr>
-          <w:lang w:val="en_US" w:bidi="en_US"/>
-        </w:rPr>
-      </w:r>
-    </w:p>
-    <w:p>
-      <w:pPr>
-        <w:pStyle w:val="Heading4"/>
-      </w:pPr>
-      <w:r>
-        <w:rPr>
-          <w:lang w:val="en_US" w:bidi="en_US"/>
-        </w:rPr>
-        <w:t>Image Content</w:t>
-      </w:r>
-      <w:r>
-        <w:rPr>
-          <w:lang w:val="en_US" w:bidi="en_US"/>
-        </w:rPr>
-      </w:r>
-    </w:p>
-    <w:p>
-      <w:pPr/>
-      <w:r>
-        <w:rPr>
-          <w:lang w:val="en_US" w:bidi="en_US"/>
-        </w:rPr>
-      </w:r>
-    </w:p>
-    <w:p>
-      <w:r>
-        <w:drawing>
-          <wp:inline xmlns:a="http://schemas.openxmlformats.org/drawingml/2006/main" xmlns:pic="http://schemas.openxmlformats.org/drawingml/2006/picture">
-            <wp:extent cx="6096000" cy="8095618"/>
-            <wp:docPr id="22" name="Picture 22"/>
-            <wp:cNvGraphicFramePr>
-              <a:graphicFrameLocks noChangeAspect="1"/>
-            </wp:cNvGraphicFramePr>
-            <a:graphic>
-              <a:graphicData uri="http://schemas.openxmlformats.org/drawingml/2006/picture">
-                <pic:pic>
-                  <pic:nvPicPr>
-                    <pic:cNvPr id="0" name="image.jpg"/>
-                    <pic:cNvPicPr/>
-                  </pic:nvPicPr>
-                  <pic:blipFill>
-                    <a:blip r:embed="rId55"/>
-                    <a:stretch>
-                      <a:fillRect/>
-                    </a:stretch>
-                  </pic:blipFill>
-                  <pic:spPr>
-                    <a:xfrm>
-                      <a:off x="0" y="0"/>
                       <a:ext cx="6096000" cy="8095618"/>
                     </a:xfrm>
                     <a:prstGeom prst="rect"/>
@@ -2659,121 +2545,7 @@
           <w:lang w:val="en_US" w:bidi="en_US"/>
         </w:rPr>
       </w:r>
-      <w:hyperlink r:id="rId56">
-        <w:r>
-          <w:rPr>
-            <w:lang w:val="en_US" w:bidi="en_US"/>
-          </w:rPr>
-          <w:rPr>
-            <w:color w:val="0000EE"/>
-            <w:u w:val="single"/>
-          </w:rPr>
-          <w:t>link</w:t>
-        </w:r>
-      </w:hyperlink>
-      <w:r>
-        <w:rPr>
-          <w:lang w:val="en_US" w:bidi="en_US"/>
-        </w:rPr>
-      </w:r>
-      <w:r>
-        <w:rPr>
-          <w:lang w:val="en_US" w:bidi="en_US"/>
-        </w:rPr>
-      </w:r>
-    </w:p>
-    <w:p>
-      <w:pPr/>
-      <w:r>
-        <w:rPr>
-          <w:lang w:val="en_US" w:bidi="en_US"/>
-        </w:rPr>
-      </w:r>
-    </w:p>
-    <w:p>
-      <w:pPr>
-        <w:pStyle w:val="Heading2"/>
-      </w:pPr>
-      <w:r>
-        <w:rPr>
-          <w:lang w:val="en_US" w:bidi="en_US"/>
-        </w:rPr>
-        <w:t>Items of Gold, Silver and Bronze</w:t>
-      </w:r>
-      <w:r>
-        <w:rPr>
-          <w:lang w:val="en_US" w:bidi="en_US"/>
-        </w:rPr>
-      </w:r>
-    </w:p>
-    <w:p>
-      <w:pPr>
-        <w:pStyle w:val="Heading4"/>
-      </w:pPr>
-      <w:r>
-        <w:rPr>
-          <w:lang w:val="en_US" w:bidi="en_US"/>
-        </w:rPr>
-        <w:t>Image Content</w:t>
-      </w:r>
-      <w:r>
-        <w:rPr>
-          <w:lang w:val="en_US" w:bidi="en_US"/>
-        </w:rPr>
-      </w:r>
-    </w:p>
-    <w:p>
-      <w:pPr/>
-      <w:r>
-        <w:rPr>
-          <w:lang w:val="en_US" w:bidi="en_US"/>
-        </w:rPr>
-      </w:r>
-    </w:p>
-    <w:p>
-      <w:r>
-        <w:drawing>
-          <wp:inline xmlns:a="http://schemas.openxmlformats.org/drawingml/2006/main" xmlns:pic="http://schemas.openxmlformats.org/drawingml/2006/picture">
-            <wp:extent cx="6096000" cy="8095618"/>
-            <wp:docPr id="23" name="Picture 23"/>
-            <wp:cNvGraphicFramePr>
-              <a:graphicFrameLocks noChangeAspect="1"/>
-            </wp:cNvGraphicFramePr>
-            <a:graphic>
-              <a:graphicData uri="http://schemas.openxmlformats.org/drawingml/2006/picture">
-                <pic:pic>
-                  <pic:nvPicPr>
-                    <pic:cNvPr id="0" name="image.jpg"/>
-                    <pic:cNvPicPr/>
-                  </pic:nvPicPr>
-                  <pic:blipFill>
-                    <a:blip r:embed="rId57"/>
-                    <a:stretch>
-                      <a:fillRect/>
-                    </a:stretch>
-                  </pic:blipFill>
-                  <pic:spPr>
-                    <a:xfrm>
-                      <a:off x="0" y="0"/>
-                      <a:ext cx="6096000" cy="8095618"/>
-                    </a:xfrm>
-                    <a:prstGeom prst="rect"/>
-                  </pic:spPr>
-                </pic:pic>
-              </a:graphicData>
-            </a:graphic>
-          </wp:inline>
-        </w:drawing>
-      </w:r>
-    </w:p>
-    <w:p>
-      <w:pPr/>
-      <w:r>
-        <w:rPr>
-          <w:lang w:val="en_US" w:bidi="en_US"/>
-        </w:rPr>
-      </w:r>
-      <w:hyperlink r:id="rId58">
+      <w:hyperlink r:id="rId54">
         <w:r>
           <w:rPr>
             <w:lang w:val="en_US" w:bidi="en_US"/>

</xml_diff>

<commit_message>
Update multiple language resources for FIAImages release 2026-06-24
</commit_message>
<xml_diff>
--- a/eng/docx/009.content.docx
+++ b/eng/docx/009.content.docx
@@ -682,7 +682,7 @@
       <w:r>
         <w:drawing>
           <wp:inline xmlns:a="http://schemas.openxmlformats.org/drawingml/2006/main" xmlns:pic="http://schemas.openxmlformats.org/drawingml/2006/picture">
-            <wp:extent cx="6096000" cy="4066032"/>
+            <wp:extent cx="6096000" cy="4090416"/>
             <wp:docPr id="5" name="Picture 5"/>
             <wp:cNvGraphicFramePr>
               <a:graphicFrameLocks noChangeAspect="1"/>
@@ -703,7 +703,7 @@
                   <pic:spPr>
                     <a:xfrm>
                       <a:off x="0" y="0"/>
-                      <a:ext cx="6096000" cy="4066032"/>
+                      <a:ext cx="6096000" cy="4090416"/>
                     </a:xfrm>
                     <a:prstGeom prst="rect"/>
                   </pic:spPr>
@@ -760,7 +760,7 @@
         <w:rPr>
           <w:lang w:val="en_US" w:bidi="en_US"/>
         </w:rPr>
-        <w:t>Inside of the Tabernacle</w:t>
+        <w:t>Inner Room</w:t>
       </w:r>
       <w:r>
         <w:rPr>
@@ -796,7 +796,7 @@
       <w:r>
         <w:drawing>
           <wp:inline xmlns:a="http://schemas.openxmlformats.org/drawingml/2006/main" xmlns:pic="http://schemas.openxmlformats.org/drawingml/2006/picture">
-            <wp:extent cx="6096000" cy="2560320"/>
+            <wp:extent cx="6096000" cy="4090416"/>
             <wp:docPr id="6" name="Picture 6"/>
             <wp:cNvGraphicFramePr>
               <a:graphicFrameLocks noChangeAspect="1"/>
@@ -817,7 +817,7 @@
                   <pic:spPr>
                     <a:xfrm>
                       <a:off x="0" y="0"/>
-                      <a:ext cx="6096000" cy="2560320"/>
+                      <a:ext cx="6096000" cy="4090416"/>
                     </a:xfrm>
                     <a:prstGeom prst="rect"/>
                   </pic:spPr>
@@ -874,7 +874,7 @@
         <w:rPr>
           <w:lang w:val="en_US" w:bidi="en_US"/>
         </w:rPr>
-        <w:t>Intestinal Worm</w:t>
+        <w:t>Inner Room</w:t>
       </w:r>
       <w:r>
         <w:rPr>
@@ -910,7 +910,7 @@
       <w:r>
         <w:drawing>
           <wp:inline xmlns:a="http://schemas.openxmlformats.org/drawingml/2006/main" xmlns:pic="http://schemas.openxmlformats.org/drawingml/2006/picture">
-            <wp:extent cx="6096000" cy="4413504"/>
+            <wp:extent cx="6096000" cy="4090416"/>
             <wp:docPr id="7" name="Picture 7"/>
             <wp:cNvGraphicFramePr>
               <a:graphicFrameLocks noChangeAspect="1"/>
@@ -931,7 +931,7 @@
                   <pic:spPr>
                     <a:xfrm>
                       <a:off x="0" y="0"/>
-                      <a:ext cx="6096000" cy="4413504"/>
+                      <a:ext cx="6096000" cy="4090416"/>
                     </a:xfrm>
                     <a:prstGeom prst="rect"/>
                   </pic:spPr>
@@ -988,7 +988,7 @@
         <w:rPr>
           <w:lang w:val="en_US" w:bidi="en_US"/>
         </w:rPr>
-        <w:t>Iron</w:t>
+        <w:t>Inside of the Tabernacle</w:t>
       </w:r>
       <w:r>
         <w:rPr>
@@ -1024,7 +1024,7 @@
       <w:r>
         <w:drawing>
           <wp:inline xmlns:a="http://schemas.openxmlformats.org/drawingml/2006/main" xmlns:pic="http://schemas.openxmlformats.org/drawingml/2006/picture">
-            <wp:extent cx="6096000" cy="4066032"/>
+            <wp:extent cx="6096000" cy="2560320"/>
             <wp:docPr id="8" name="Picture 8"/>
             <wp:cNvGraphicFramePr>
               <a:graphicFrameLocks noChangeAspect="1"/>
@@ -1045,7 +1045,7 @@
                   <pic:spPr>
                     <a:xfrm>
                       <a:off x="0" y="0"/>
-                      <a:ext cx="6096000" cy="4066032"/>
+                      <a:ext cx="6096000" cy="2560320"/>
                     </a:xfrm>
                     <a:prstGeom prst="rect"/>
                   </pic:spPr>
@@ -1102,7 +1102,7 @@
         <w:rPr>
           <w:lang w:val="en_US" w:bidi="en_US"/>
         </w:rPr>
-        <w:t>Iron</w:t>
+        <w:t>Intestinal Worm</w:t>
       </w:r>
       <w:r>
         <w:rPr>
@@ -1138,7 +1138,7 @@
       <w:r>
         <w:drawing>
           <wp:inline xmlns:a="http://schemas.openxmlformats.org/drawingml/2006/main" xmlns:pic="http://schemas.openxmlformats.org/drawingml/2006/picture">
-            <wp:extent cx="6096000" cy="4066032"/>
+            <wp:extent cx="6096000" cy="4413504"/>
             <wp:docPr id="9" name="Picture 9"/>
             <wp:cNvGraphicFramePr>
               <a:graphicFrameLocks noChangeAspect="1"/>
@@ -1159,7 +1159,7 @@
                   <pic:spPr>
                     <a:xfrm>
                       <a:off x="0" y="0"/>
-                      <a:ext cx="6096000" cy="4066032"/>
+                      <a:ext cx="6096000" cy="4413504"/>
                     </a:xfrm>
                     <a:prstGeom prst="rect"/>
                   </pic:spPr>
@@ -1252,7 +1252,7 @@
       <w:r>
         <w:drawing>
           <wp:inline xmlns:a="http://schemas.openxmlformats.org/drawingml/2006/main" xmlns:pic="http://schemas.openxmlformats.org/drawingml/2006/picture">
-            <wp:extent cx="6096000" cy="3846576"/>
+            <wp:extent cx="6096000" cy="4066032"/>
             <wp:docPr id="10" name="Picture 10"/>
             <wp:cNvGraphicFramePr>
               <a:graphicFrameLocks noChangeAspect="1"/>
@@ -1273,7 +1273,7 @@
                   <pic:spPr>
                     <a:xfrm>
                       <a:off x="0" y="0"/>
-                      <a:ext cx="6096000" cy="3846576"/>
+                      <a:ext cx="6096000" cy="4066032"/>
                     </a:xfrm>
                     <a:prstGeom prst="rect"/>
                   </pic:spPr>
@@ -1366,7 +1366,7 @@
       <w:r>
         <w:drawing>
           <wp:inline xmlns:a="http://schemas.openxmlformats.org/drawingml/2006/main" xmlns:pic="http://schemas.openxmlformats.org/drawingml/2006/picture">
-            <wp:extent cx="6096000" cy="6457627"/>
+            <wp:extent cx="6096000" cy="4066032"/>
             <wp:docPr id="11" name="Picture 11"/>
             <wp:cNvGraphicFramePr>
               <a:graphicFrameLocks noChangeAspect="1"/>
@@ -1387,7 +1387,7 @@
                   <pic:spPr>
                     <a:xfrm>
                       <a:off x="0" y="0"/>
-                      <a:ext cx="6096000" cy="6457627"/>
+                      <a:ext cx="6096000" cy="4066032"/>
                     </a:xfrm>
                     <a:prstGeom prst="rect"/>
                   </pic:spPr>
@@ -1444,7 +1444,7 @@
         <w:rPr>
           <w:lang w:val="en_US" w:bidi="en_US"/>
         </w:rPr>
-        <w:t>Iron Gate</w:t>
+        <w:t>Iron</w:t>
       </w:r>
       <w:r>
         <w:rPr>
@@ -1480,7 +1480,7 @@
       <w:r>
         <w:drawing>
           <wp:inline xmlns:a="http://schemas.openxmlformats.org/drawingml/2006/main" xmlns:pic="http://schemas.openxmlformats.org/drawingml/2006/picture">
-            <wp:extent cx="6096000" cy="4090416"/>
+            <wp:extent cx="6096000" cy="3846576"/>
             <wp:docPr id="12" name="Picture 12"/>
             <wp:cNvGraphicFramePr>
               <a:graphicFrameLocks noChangeAspect="1"/>
@@ -1501,7 +1501,7 @@
                   <pic:spPr>
                     <a:xfrm>
                       <a:off x="0" y="0"/>
-                      <a:ext cx="6096000" cy="4090416"/>
+                      <a:ext cx="6096000" cy="3846576"/>
                     </a:xfrm>
                     <a:prstGeom prst="rect"/>
                   </pic:spPr>
@@ -1558,7 +1558,7 @@
         <w:rPr>
           <w:lang w:val="en_US" w:bidi="en_US"/>
         </w:rPr>
-        <w:t>Iron Gate</w:t>
+        <w:t>Iron</w:t>
       </w:r>
       <w:r>
         <w:rPr>
@@ -1594,7 +1594,7 @@
       <w:r>
         <w:drawing>
           <wp:inline xmlns:a="http://schemas.openxmlformats.org/drawingml/2006/main" xmlns:pic="http://schemas.openxmlformats.org/drawingml/2006/picture">
-            <wp:extent cx="6096000" cy="4090416"/>
+            <wp:extent cx="6096000" cy="6457627"/>
             <wp:docPr id="13" name="Picture 13"/>
             <wp:cNvGraphicFramePr>
               <a:graphicFrameLocks noChangeAspect="1"/>
@@ -1615,7 +1615,7 @@
                   <pic:spPr>
                     <a:xfrm>
                       <a:off x="0" y="0"/>
-                      <a:ext cx="6096000" cy="4090416"/>
+                      <a:ext cx="6096000" cy="6457627"/>
                     </a:xfrm>
                     <a:prstGeom prst="rect"/>
                   </pic:spPr>
@@ -1786,7 +1786,7 @@
         <w:rPr>
           <w:lang w:val="en_US" w:bidi="en_US"/>
         </w:rPr>
-        <w:t>Israelite Soldier Wearing a Sword</w:t>
+        <w:t>Iron Gate</w:t>
       </w:r>
       <w:r>
         <w:rPr>
@@ -1822,7 +1822,7 @@
       <w:r>
         <w:drawing>
           <wp:inline xmlns:a="http://schemas.openxmlformats.org/drawingml/2006/main" xmlns:pic="http://schemas.openxmlformats.org/drawingml/2006/picture">
-            <wp:extent cx="6096000" cy="8095618"/>
+            <wp:extent cx="6096000" cy="4090416"/>
             <wp:docPr id="15" name="Picture 15"/>
             <wp:cNvGraphicFramePr>
               <a:graphicFrameLocks noChangeAspect="1"/>
@@ -1843,7 +1843,7 @@
                   <pic:spPr>
                     <a:xfrm>
                       <a:off x="0" y="0"/>
-                      <a:ext cx="6096000" cy="8095618"/>
+                      <a:ext cx="6096000" cy="4090416"/>
                     </a:xfrm>
                     <a:prstGeom prst="rect"/>
                   </pic:spPr>
@@ -1900,7 +1900,7 @@
         <w:rPr>
           <w:lang w:val="en_US" w:bidi="en_US"/>
         </w:rPr>
-        <w:t>Israelite Soldier Wearing a Sword</w:t>
+        <w:t>Iron Gate</w:t>
       </w:r>
       <w:r>
         <w:rPr>
@@ -1936,7 +1936,7 @@
       <w:r>
         <w:drawing>
           <wp:inline xmlns:a="http://schemas.openxmlformats.org/drawingml/2006/main" xmlns:pic="http://schemas.openxmlformats.org/drawingml/2006/picture">
-            <wp:extent cx="6096000" cy="11124088"/>
+            <wp:extent cx="6096000" cy="4090416"/>
             <wp:docPr id="16" name="Picture 16"/>
             <wp:cNvGraphicFramePr>
               <a:graphicFrameLocks noChangeAspect="1"/>
@@ -1957,7 +1957,7 @@
                   <pic:spPr>
                     <a:xfrm>
                       <a:off x="0" y="0"/>
-                      <a:ext cx="6096000" cy="11124088"/>
+                      <a:ext cx="6096000" cy="4090416"/>
                     </a:xfrm>
                     <a:prstGeom prst="rect"/>
                   </pic:spPr>
@@ -2050,7 +2050,7 @@
       <w:r>
         <w:drawing>
           <wp:inline xmlns:a="http://schemas.openxmlformats.org/drawingml/2006/main" xmlns:pic="http://schemas.openxmlformats.org/drawingml/2006/picture">
-            <wp:extent cx="6096000" cy="4066032"/>
+            <wp:extent cx="6096000" cy="8095618"/>
             <wp:docPr id="17" name="Picture 17"/>
             <wp:cNvGraphicFramePr>
               <a:graphicFrameLocks noChangeAspect="1"/>
@@ -2071,7 +2071,7 @@
                   <pic:spPr>
                     <a:xfrm>
                       <a:off x="0" y="0"/>
-                      <a:ext cx="6096000" cy="4066032"/>
+                      <a:ext cx="6096000" cy="8095618"/>
                     </a:xfrm>
                     <a:prstGeom prst="rect"/>
                   </pic:spPr>
@@ -2128,7 +2128,7 @@
         <w:rPr>
           <w:lang w:val="en_US" w:bidi="en_US"/>
         </w:rPr>
-        <w:t>Israelites Camping Around Tabernacle</w:t>
+        <w:t>Israelite Soldier Wearing a Sword</w:t>
       </w:r>
       <w:r>
         <w:rPr>
@@ -2164,7 +2164,7 @@
       <w:r>
         <w:drawing>
           <wp:inline xmlns:a="http://schemas.openxmlformats.org/drawingml/2006/main" xmlns:pic="http://schemas.openxmlformats.org/drawingml/2006/picture">
-            <wp:extent cx="6096000" cy="3432048"/>
+            <wp:extent cx="6096000" cy="11124088"/>
             <wp:docPr id="18" name="Picture 18"/>
             <wp:cNvGraphicFramePr>
               <a:graphicFrameLocks noChangeAspect="1"/>
@@ -2185,7 +2185,7 @@
                   <pic:spPr>
                     <a:xfrm>
                       <a:off x="0" y="0"/>
-                      <a:ext cx="6096000" cy="3432048"/>
+                      <a:ext cx="6096000" cy="11124088"/>
                     </a:xfrm>
                     <a:prstGeom prst="rect"/>
                   </pic:spPr>
@@ -2242,7 +2242,7 @@
         <w:rPr>
           <w:lang w:val="en_US" w:bidi="en_US"/>
         </w:rPr>
-        <w:t>Items of Gold, Silver and Bronze</w:t>
+        <w:t>Israelite Soldier Wearing a Sword</w:t>
       </w:r>
       <w:r>
         <w:rPr>
@@ -2278,7 +2278,7 @@
       <w:r>
         <w:drawing>
           <wp:inline xmlns:a="http://schemas.openxmlformats.org/drawingml/2006/main" xmlns:pic="http://schemas.openxmlformats.org/drawingml/2006/picture">
-            <wp:extent cx="6096000" cy="4322064"/>
+            <wp:extent cx="6096000" cy="4066032"/>
             <wp:docPr id="19" name="Picture 19"/>
             <wp:cNvGraphicFramePr>
               <a:graphicFrameLocks noChangeAspect="1"/>
@@ -2299,7 +2299,7 @@
                   <pic:spPr>
                     <a:xfrm>
                       <a:off x="0" y="0"/>
-                      <a:ext cx="6096000" cy="4322064"/>
+                      <a:ext cx="6096000" cy="4066032"/>
                     </a:xfrm>
                     <a:prstGeom prst="rect"/>
                   </pic:spPr>
@@ -2356,7 +2356,7 @@
         <w:rPr>
           <w:lang w:val="en_US" w:bidi="en_US"/>
         </w:rPr>
-        <w:t>Items of Gold, Silver and Bronze</w:t>
+        <w:t>Israelites Camping Around Tabernacle</w:t>
       </w:r>
       <w:r>
         <w:rPr>
@@ -2392,7 +2392,7 @@
       <w:r>
         <w:drawing>
           <wp:inline xmlns:a="http://schemas.openxmlformats.org/drawingml/2006/main" xmlns:pic="http://schemas.openxmlformats.org/drawingml/2006/picture">
-            <wp:extent cx="6096000" cy="8095618"/>
+            <wp:extent cx="6096000" cy="3432048"/>
             <wp:docPr id="20" name="Picture 20"/>
             <wp:cNvGraphicFramePr>
               <a:graphicFrameLocks noChangeAspect="1"/>
@@ -2413,7 +2413,7 @@
                   <pic:spPr>
                     <a:xfrm>
                       <a:off x="0" y="0"/>
-                      <a:ext cx="6096000" cy="8095618"/>
+                      <a:ext cx="6096000" cy="3432048"/>
                     </a:xfrm>
                     <a:prstGeom prst="rect"/>
                   </pic:spPr>
@@ -2470,7 +2470,7 @@
         <w:rPr>
           <w:lang w:val="en_US" w:bidi="en_US"/>
         </w:rPr>
-        <w:t>Items of Gold, Silver and Bronze</w:t>
+        <w:t>Italian Locust</w:t>
       </w:r>
       <w:r>
         <w:rPr>
@@ -2506,7 +2506,7 @@
       <w:r>
         <w:drawing>
           <wp:inline xmlns:a="http://schemas.openxmlformats.org/drawingml/2006/main" xmlns:pic="http://schemas.openxmlformats.org/drawingml/2006/picture">
-            <wp:extent cx="6096000" cy="8095618"/>
+            <wp:extent cx="6096000" cy="4059936"/>
             <wp:docPr id="21" name="Picture 21"/>
             <wp:cNvGraphicFramePr>
               <a:graphicFrameLocks noChangeAspect="1"/>
@@ -2527,6 +2527,348 @@
                   <pic:spPr>
                     <a:xfrm>
                       <a:off x="0" y="0"/>
+                      <a:ext cx="6096000" cy="4059936"/>
+                    </a:xfrm>
+                    <a:prstGeom prst="rect"/>
+                  </pic:spPr>
+                </pic:pic>
+              </a:graphicData>
+            </a:graphic>
+          </wp:inline>
+        </w:drawing>
+      </w:r>
+    </w:p>
+    <w:p>
+      <w:pPr/>
+      <w:r>
+        <w:rPr>
+          <w:lang w:val="en_US" w:bidi="en_US"/>
+        </w:rPr>
+      </w:r>
+      <w:hyperlink r:id="rId54">
+        <w:r>
+          <w:rPr>
+            <w:lang w:val="en_US" w:bidi="en_US"/>
+          </w:rPr>
+          <w:rPr>
+            <w:color w:val="0000EE"/>
+            <w:u w:val="single"/>
+          </w:rPr>
+          <w:t>link</w:t>
+        </w:r>
+      </w:hyperlink>
+      <w:r>
+        <w:rPr>
+          <w:lang w:val="en_US" w:bidi="en_US"/>
+        </w:rPr>
+      </w:r>
+      <w:r>
+        <w:rPr>
+          <w:lang w:val="en_US" w:bidi="en_US"/>
+        </w:rPr>
+      </w:r>
+    </w:p>
+    <w:p>
+      <w:pPr/>
+      <w:r>
+        <w:rPr>
+          <w:lang w:val="en_US" w:bidi="en_US"/>
+        </w:rPr>
+      </w:r>
+    </w:p>
+    <w:p>
+      <w:pPr>
+        <w:pStyle w:val="Heading2"/>
+      </w:pPr>
+      <w:r>
+        <w:rPr>
+          <w:lang w:val="en_US" w:bidi="en_US"/>
+        </w:rPr>
+        <w:t>Italian Locust</w:t>
+      </w:r>
+      <w:r>
+        <w:rPr>
+          <w:lang w:val="en_US" w:bidi="en_US"/>
+        </w:rPr>
+      </w:r>
+    </w:p>
+    <w:p>
+      <w:pPr>
+        <w:pStyle w:val="Heading4"/>
+      </w:pPr>
+      <w:r>
+        <w:rPr>
+          <w:lang w:val="en_US" w:bidi="en_US"/>
+        </w:rPr>
+        <w:t>Image Content</w:t>
+      </w:r>
+      <w:r>
+        <w:rPr>
+          <w:lang w:val="en_US" w:bidi="en_US"/>
+        </w:rPr>
+      </w:r>
+    </w:p>
+    <w:p>
+      <w:pPr/>
+      <w:r>
+        <w:rPr>
+          <w:lang w:val="en_US" w:bidi="en_US"/>
+        </w:rPr>
+      </w:r>
+    </w:p>
+    <w:p>
+      <w:r>
+        <w:drawing>
+          <wp:inline xmlns:a="http://schemas.openxmlformats.org/drawingml/2006/main" xmlns:pic="http://schemas.openxmlformats.org/drawingml/2006/picture">
+            <wp:extent cx="6096000" cy="4572000"/>
+            <wp:docPr id="22" name="Picture 22"/>
+            <wp:cNvGraphicFramePr>
+              <a:graphicFrameLocks noChangeAspect="1"/>
+            </wp:cNvGraphicFramePr>
+            <a:graphic>
+              <a:graphicData uri="http://schemas.openxmlformats.org/drawingml/2006/picture">
+                <pic:pic>
+                  <pic:nvPicPr>
+                    <pic:cNvPr id="0" name="image.jpg"/>
+                    <pic:cNvPicPr/>
+                  </pic:nvPicPr>
+                  <pic:blipFill>
+                    <a:blip r:embed="rId55"/>
+                    <a:stretch>
+                      <a:fillRect/>
+                    </a:stretch>
+                  </pic:blipFill>
+                  <pic:spPr>
+                    <a:xfrm>
+                      <a:off x="0" y="0"/>
+                      <a:ext cx="6096000" cy="4572000"/>
+                    </a:xfrm>
+                    <a:prstGeom prst="rect"/>
+                  </pic:spPr>
+                </pic:pic>
+              </a:graphicData>
+            </a:graphic>
+          </wp:inline>
+        </w:drawing>
+      </w:r>
+    </w:p>
+    <w:p>
+      <w:pPr/>
+      <w:r>
+        <w:rPr>
+          <w:lang w:val="en_US" w:bidi="en_US"/>
+        </w:rPr>
+      </w:r>
+      <w:hyperlink r:id="rId56">
+        <w:r>
+          <w:rPr>
+            <w:lang w:val="en_US" w:bidi="en_US"/>
+          </w:rPr>
+          <w:rPr>
+            <w:color w:val="0000EE"/>
+            <w:u w:val="single"/>
+          </w:rPr>
+          <w:t>link</w:t>
+        </w:r>
+      </w:hyperlink>
+      <w:r>
+        <w:rPr>
+          <w:lang w:val="en_US" w:bidi="en_US"/>
+        </w:rPr>
+      </w:r>
+      <w:r>
+        <w:rPr>
+          <w:lang w:val="en_US" w:bidi="en_US"/>
+        </w:rPr>
+      </w:r>
+    </w:p>
+    <w:p>
+      <w:pPr/>
+      <w:r>
+        <w:rPr>
+          <w:lang w:val="en_US" w:bidi="en_US"/>
+        </w:rPr>
+      </w:r>
+    </w:p>
+    <w:p>
+      <w:pPr>
+        <w:pStyle w:val="Heading2"/>
+      </w:pPr>
+      <w:r>
+        <w:rPr>
+          <w:lang w:val="en_US" w:bidi="en_US"/>
+        </w:rPr>
+        <w:t>Items of Gold, Silver and Bronze</w:t>
+      </w:r>
+      <w:r>
+        <w:rPr>
+          <w:lang w:val="en_US" w:bidi="en_US"/>
+        </w:rPr>
+      </w:r>
+    </w:p>
+    <w:p>
+      <w:pPr>
+        <w:pStyle w:val="Heading4"/>
+      </w:pPr>
+      <w:r>
+        <w:rPr>
+          <w:lang w:val="en_US" w:bidi="en_US"/>
+        </w:rPr>
+        <w:t>Image Content</w:t>
+      </w:r>
+      <w:r>
+        <w:rPr>
+          <w:lang w:val="en_US" w:bidi="en_US"/>
+        </w:rPr>
+      </w:r>
+    </w:p>
+    <w:p>
+      <w:pPr/>
+      <w:r>
+        <w:rPr>
+          <w:lang w:val="en_US" w:bidi="en_US"/>
+        </w:rPr>
+      </w:r>
+    </w:p>
+    <w:p>
+      <w:r>
+        <w:drawing>
+          <wp:inline xmlns:a="http://schemas.openxmlformats.org/drawingml/2006/main" xmlns:pic="http://schemas.openxmlformats.org/drawingml/2006/picture">
+            <wp:extent cx="6096000" cy="4322064"/>
+            <wp:docPr id="23" name="Picture 23"/>
+            <wp:cNvGraphicFramePr>
+              <a:graphicFrameLocks noChangeAspect="1"/>
+            </wp:cNvGraphicFramePr>
+            <a:graphic>
+              <a:graphicData uri="http://schemas.openxmlformats.org/drawingml/2006/picture">
+                <pic:pic>
+                  <pic:nvPicPr>
+                    <pic:cNvPr id="0" name="image.jpg"/>
+                    <pic:cNvPicPr/>
+                  </pic:nvPicPr>
+                  <pic:blipFill>
+                    <a:blip r:embed="rId57"/>
+                    <a:stretch>
+                      <a:fillRect/>
+                    </a:stretch>
+                  </pic:blipFill>
+                  <pic:spPr>
+                    <a:xfrm>
+                      <a:off x="0" y="0"/>
+                      <a:ext cx="6096000" cy="4322064"/>
+                    </a:xfrm>
+                    <a:prstGeom prst="rect"/>
+                  </pic:spPr>
+                </pic:pic>
+              </a:graphicData>
+            </a:graphic>
+          </wp:inline>
+        </w:drawing>
+      </w:r>
+    </w:p>
+    <w:p>
+      <w:pPr/>
+      <w:r>
+        <w:rPr>
+          <w:lang w:val="en_US" w:bidi="en_US"/>
+        </w:rPr>
+      </w:r>
+      <w:hyperlink r:id="rId58">
+        <w:r>
+          <w:rPr>
+            <w:lang w:val="en_US" w:bidi="en_US"/>
+          </w:rPr>
+          <w:rPr>
+            <w:color w:val="0000EE"/>
+            <w:u w:val="single"/>
+          </w:rPr>
+          <w:t>link</w:t>
+        </w:r>
+      </w:hyperlink>
+      <w:r>
+        <w:rPr>
+          <w:lang w:val="en_US" w:bidi="en_US"/>
+        </w:rPr>
+      </w:r>
+      <w:r>
+        <w:rPr>
+          <w:lang w:val="en_US" w:bidi="en_US"/>
+        </w:rPr>
+      </w:r>
+    </w:p>
+    <w:p>
+      <w:pPr/>
+      <w:r>
+        <w:rPr>
+          <w:lang w:val="en_US" w:bidi="en_US"/>
+        </w:rPr>
+      </w:r>
+    </w:p>
+    <w:p>
+      <w:pPr>
+        <w:pStyle w:val="Heading2"/>
+      </w:pPr>
+      <w:r>
+        <w:rPr>
+          <w:lang w:val="en_US" w:bidi="en_US"/>
+        </w:rPr>
+        <w:t>Items of Gold, Silver and Bronze</w:t>
+      </w:r>
+      <w:r>
+        <w:rPr>
+          <w:lang w:val="en_US" w:bidi="en_US"/>
+        </w:rPr>
+      </w:r>
+    </w:p>
+    <w:p>
+      <w:pPr>
+        <w:pStyle w:val="Heading4"/>
+      </w:pPr>
+      <w:r>
+        <w:rPr>
+          <w:lang w:val="en_US" w:bidi="en_US"/>
+        </w:rPr>
+        <w:t>Image Content</w:t>
+      </w:r>
+      <w:r>
+        <w:rPr>
+          <w:lang w:val="en_US" w:bidi="en_US"/>
+        </w:rPr>
+      </w:r>
+    </w:p>
+    <w:p>
+      <w:pPr/>
+      <w:r>
+        <w:rPr>
+          <w:lang w:val="en_US" w:bidi="en_US"/>
+        </w:rPr>
+      </w:r>
+    </w:p>
+    <w:p>
+      <w:r>
+        <w:drawing>
+          <wp:inline xmlns:a="http://schemas.openxmlformats.org/drawingml/2006/main" xmlns:pic="http://schemas.openxmlformats.org/drawingml/2006/picture">
+            <wp:extent cx="6096000" cy="8095618"/>
+            <wp:docPr id="24" name="Picture 24"/>
+            <wp:cNvGraphicFramePr>
+              <a:graphicFrameLocks noChangeAspect="1"/>
+            </wp:cNvGraphicFramePr>
+            <a:graphic>
+              <a:graphicData uri="http://schemas.openxmlformats.org/drawingml/2006/picture">
+                <pic:pic>
+                  <pic:nvPicPr>
+                    <pic:cNvPr id="0" name="image.jpg"/>
+                    <pic:cNvPicPr/>
+                  </pic:nvPicPr>
+                  <pic:blipFill>
+                    <a:blip r:embed="rId59"/>
+                    <a:stretch>
+                      <a:fillRect/>
+                    </a:stretch>
+                  </pic:blipFill>
+                  <pic:spPr>
+                    <a:xfrm>
+                      <a:off x="0" y="0"/>
                       <a:ext cx="6096000" cy="8095618"/>
                     </a:xfrm>
                     <a:prstGeom prst="rect"/>
@@ -2545,7 +2887,121 @@
           <w:lang w:val="en_US" w:bidi="en_US"/>
         </w:rPr>
       </w:r>
-      <w:hyperlink r:id="rId54">
+      <w:hyperlink r:id="rId60">
+        <w:r>
+          <w:rPr>
+            <w:lang w:val="en_US" w:bidi="en_US"/>
+          </w:rPr>
+          <w:rPr>
+            <w:color w:val="0000EE"/>
+            <w:u w:val="single"/>
+          </w:rPr>
+          <w:t>link</w:t>
+        </w:r>
+      </w:hyperlink>
+      <w:r>
+        <w:rPr>
+          <w:lang w:val="en_US" w:bidi="en_US"/>
+        </w:rPr>
+      </w:r>
+      <w:r>
+        <w:rPr>
+          <w:lang w:val="en_US" w:bidi="en_US"/>
+        </w:rPr>
+      </w:r>
+    </w:p>
+    <w:p>
+      <w:pPr/>
+      <w:r>
+        <w:rPr>
+          <w:lang w:val="en_US" w:bidi="en_US"/>
+        </w:rPr>
+      </w:r>
+    </w:p>
+    <w:p>
+      <w:pPr>
+        <w:pStyle w:val="Heading2"/>
+      </w:pPr>
+      <w:r>
+        <w:rPr>
+          <w:lang w:val="en_US" w:bidi="en_US"/>
+        </w:rPr>
+        <w:t>Items of Gold, Silver and Bronze</w:t>
+      </w:r>
+      <w:r>
+        <w:rPr>
+          <w:lang w:val="en_US" w:bidi="en_US"/>
+        </w:rPr>
+      </w:r>
+    </w:p>
+    <w:p>
+      <w:pPr>
+        <w:pStyle w:val="Heading4"/>
+      </w:pPr>
+      <w:r>
+        <w:rPr>
+          <w:lang w:val="en_US" w:bidi="en_US"/>
+        </w:rPr>
+        <w:t>Image Content</w:t>
+      </w:r>
+      <w:r>
+        <w:rPr>
+          <w:lang w:val="en_US" w:bidi="en_US"/>
+        </w:rPr>
+      </w:r>
+    </w:p>
+    <w:p>
+      <w:pPr/>
+      <w:r>
+        <w:rPr>
+          <w:lang w:val="en_US" w:bidi="en_US"/>
+        </w:rPr>
+      </w:r>
+    </w:p>
+    <w:p>
+      <w:r>
+        <w:drawing>
+          <wp:inline xmlns:a="http://schemas.openxmlformats.org/drawingml/2006/main" xmlns:pic="http://schemas.openxmlformats.org/drawingml/2006/picture">
+            <wp:extent cx="6096000" cy="8095618"/>
+            <wp:docPr id="25" name="Picture 25"/>
+            <wp:cNvGraphicFramePr>
+              <a:graphicFrameLocks noChangeAspect="1"/>
+            </wp:cNvGraphicFramePr>
+            <a:graphic>
+              <a:graphicData uri="http://schemas.openxmlformats.org/drawingml/2006/picture">
+                <pic:pic>
+                  <pic:nvPicPr>
+                    <pic:cNvPr id="0" name="image.jpg"/>
+                    <pic:cNvPicPr/>
+                  </pic:nvPicPr>
+                  <pic:blipFill>
+                    <a:blip r:embed="rId61"/>
+                    <a:stretch>
+                      <a:fillRect/>
+                    </a:stretch>
+                  </pic:blipFill>
+                  <pic:spPr>
+                    <a:xfrm>
+                      <a:off x="0" y="0"/>
+                      <a:ext cx="6096000" cy="8095618"/>
+                    </a:xfrm>
+                    <a:prstGeom prst="rect"/>
+                  </pic:spPr>
+                </pic:pic>
+              </a:graphicData>
+            </a:graphic>
+          </wp:inline>
+        </w:drawing>
+      </w:r>
+    </w:p>
+    <w:p>
+      <w:pPr/>
+      <w:r>
+        <w:rPr>
+          <w:lang w:val="en_US" w:bidi="en_US"/>
+        </w:rPr>
+      </w:r>
+      <w:hyperlink r:id="rId62">
         <w:r>
           <w:rPr>
             <w:lang w:val="en_US" w:bidi="en_US"/>

</xml_diff>